<commit_message>
feat: add collaborators tab and update associate fields
</commit_message>
<xml_diff>
--- a/Models/2026-03_Annonce-Legale-Journal_Template.docx
+++ b/Models/2026-03_Annonce-Legale-Journal_Template.docx
@@ -57,7 +57,7 @@
           <w:sz w:val="18"/>
           <w:szCs w:val="18"/>
         </w:rPr>
-        <w:t>{{DENOMINATION_SOCIALE}} {{FORME_JURIDIQUE}}</w:t>
+        <w:t>{{ DENOMINATION_SOCIALE }} {{ FORME_JURIDIQUE }}</w:t>
       </w:r>
       <w:r>
         <w:rPr>
@@ -142,7 +142,7 @@
           <w:sz w:val="18"/>
           <w:szCs w:val="18"/>
         </w:rPr>
-        <w:t>{{DTAE_CONTRAT}}</w:t>
+        <w:t>{{ DTAE_CONTRAT }}</w:t>
       </w:r>
       <w:r>
         <w:rPr>
@@ -205,7 +205,7 @@
           <w:sz w:val="18"/>
           <w:szCs w:val="18"/>
         </w:rPr>
-        <w:t>{{FORME_JURIDIQUE}}</w:t>
+        <w:t>{{ FORME_JURIDIQUE }}</w:t>
       </w:r>
       <w:r>
         <w:rPr>
@@ -273,21 +273,7 @@
           <w:sz w:val="18"/>
           <w:szCs w:val="18"/>
         </w:rPr>
-        <w:t>{{</w:t>
-      </w:r>
-      <w:r>
-        <w:rPr>
-          <w:sz w:val="18"/>
-          <w:szCs w:val="18"/>
-        </w:rPr>
-        <w:t>DENOMINATION_SOCIALE</w:t>
-      </w:r>
-      <w:r>
-        <w:rPr>
-          <w:sz w:val="18"/>
-          <w:szCs w:val="18"/>
-        </w:rPr>
-        <w:t>}}</w:t>
+        <w:t>{{ DENOMINATION_SOCIALE }}</w:t>
       </w:r>
       <w:r>
         <w:rPr>
@@ -347,7 +333,7 @@
           <w:sz w:val="18"/>
           <w:szCs w:val="18"/>
         </w:rPr>
-        <w:t>{{ACTIVITY1}}</w:t>
+        <w:t>{{ ACTIVITY1 }}</w:t>
       </w:r>
       <w:r>
         <w:rPr>
@@ -368,25 +354,7 @@
           <w:sz w:val="18"/>
           <w:szCs w:val="18"/>
         </w:rPr>
-        <w:t>{{ACTIVITY</w:t>
-      </w:r>
-      <w:r>
-        <w:rPr>
-          <w:rFonts w:asciiTheme="majorBidi" w:hAnsiTheme="majorBidi" w:cstheme="majorBidi"/>
-          <w:bCs/>
-          <w:sz w:val="18"/>
-          <w:szCs w:val="18"/>
-        </w:rPr>
-        <w:t>2</w:t>
-      </w:r>
-      <w:r>
-        <w:rPr>
-          <w:rFonts w:asciiTheme="majorBidi" w:hAnsiTheme="majorBidi" w:cstheme="majorBidi"/>
-          <w:bCs/>
-          <w:sz w:val="18"/>
-          <w:szCs w:val="18"/>
-        </w:rPr>
-        <w:t>}}</w:t>
+        <w:t>{{ ACTIVITY2 }}</w:t>
       </w:r>
       <w:r>
         <w:rPr>
@@ -404,25 +372,7 @@
           <w:sz w:val="18"/>
           <w:szCs w:val="18"/>
         </w:rPr>
-        <w:t>{{ACTIVITY</w:t>
-      </w:r>
-      <w:r>
-        <w:rPr>
-          <w:rFonts w:asciiTheme="majorBidi" w:hAnsiTheme="majorBidi" w:cstheme="majorBidi"/>
-          <w:bCs/>
-          <w:sz w:val="18"/>
-          <w:szCs w:val="18"/>
-        </w:rPr>
-        <w:t>3</w:t>
-      </w:r>
-      <w:r>
-        <w:rPr>
-          <w:rFonts w:asciiTheme="majorBidi" w:hAnsiTheme="majorBidi" w:cstheme="majorBidi"/>
-          <w:bCs/>
-          <w:sz w:val="18"/>
-          <w:szCs w:val="18"/>
-        </w:rPr>
-        <w:t>}}</w:t>
+        <w:t>{{ ACTIVITY3 }}</w:t>
       </w:r>
       <w:r>
         <w:rPr>
@@ -443,25 +393,7 @@
           <w:sz w:val="18"/>
           <w:szCs w:val="18"/>
         </w:rPr>
-        <w:t>{{ACTIVITY</w:t>
-      </w:r>
-      <w:r>
-        <w:rPr>
-          <w:rFonts w:asciiTheme="majorBidi" w:hAnsiTheme="majorBidi" w:cstheme="majorBidi"/>
-          <w:bCs/>
-          <w:sz w:val="18"/>
-          <w:szCs w:val="18"/>
-        </w:rPr>
-        <w:t>4</w:t>
-      </w:r>
-      <w:r>
-        <w:rPr>
-          <w:rFonts w:asciiTheme="majorBidi" w:hAnsiTheme="majorBidi" w:cstheme="majorBidi"/>
-          <w:bCs/>
-          <w:sz w:val="18"/>
-          <w:szCs w:val="18"/>
-        </w:rPr>
-        <w:t>}}</w:t>
+        <w:t>{{ ACTIVITY4 }}</w:t>
       </w:r>
       <w:r>
         <w:rPr>
@@ -482,25 +414,7 @@
           <w:sz w:val="18"/>
           <w:szCs w:val="18"/>
         </w:rPr>
-        <w:t>{{ACTIVITY</w:t>
-      </w:r>
-      <w:r>
-        <w:rPr>
-          <w:rFonts w:asciiTheme="majorBidi" w:hAnsiTheme="majorBidi" w:cstheme="majorBidi"/>
-          <w:bCs/>
-          <w:sz w:val="18"/>
-          <w:szCs w:val="18"/>
-        </w:rPr>
-        <w:t>5</w:t>
-      </w:r>
-      <w:r>
-        <w:rPr>
-          <w:rFonts w:asciiTheme="majorBidi" w:hAnsiTheme="majorBidi" w:cstheme="majorBidi"/>
-          <w:bCs/>
-          <w:sz w:val="18"/>
-          <w:szCs w:val="18"/>
-        </w:rPr>
-        <w:t>}}</w:t>
+        <w:t>{{ ACTIVITY5 }}</w:t>
       </w:r>
       <w:r>
         <w:rPr>
@@ -521,25 +435,7 @@
           <w:sz w:val="18"/>
           <w:szCs w:val="18"/>
         </w:rPr>
-        <w:t>{{ACTIVITY</w:t>
-      </w:r>
-      <w:r>
-        <w:rPr>
-          <w:rFonts w:asciiTheme="majorBidi" w:hAnsiTheme="majorBidi" w:cstheme="majorBidi"/>
-          <w:bCs/>
-          <w:sz w:val="18"/>
-          <w:szCs w:val="18"/>
-        </w:rPr>
-        <w:t>6</w:t>
-      </w:r>
-      <w:r>
-        <w:rPr>
-          <w:rFonts w:asciiTheme="majorBidi" w:hAnsiTheme="majorBidi" w:cstheme="majorBidi"/>
-          <w:bCs/>
-          <w:sz w:val="18"/>
-          <w:szCs w:val="18"/>
-        </w:rPr>
-        <w:t>}}</w:t>
+        <w:t>{{ ACTIVITY6 }}</w:t>
       </w:r>
     </w:p>
     <w:p>
@@ -577,7 +473,7 @@
           <w:sz w:val="18"/>
           <w:szCs w:val="18"/>
         </w:rPr>
-        <w:t>{{ADRESSE_SIEGE_SOCIAL}}</w:t>
+        <w:t>{{ ADRESSE_SIEGE_SOCIAL }}</w:t>
       </w:r>
       <w:r>
         <w:rPr>
@@ -701,7 +597,7 @@
           <w:sz w:val="18"/>
           <w:szCs w:val="18"/>
         </w:rPr>
-        <w:t>{{CAPITAL_SOCIAL}}</w:t>
+        <w:t>{{ CAPITAL_SOCIAL }}</w:t>
       </w:r>
       <w:r>
         <w:rPr>
@@ -748,7 +644,7 @@
           <w:sz w:val="18"/>
           <w:szCs w:val="18"/>
         </w:rPr>
-        <w:t>{{NOMBRE_PARTS_SOCIALES}}</w:t>
+        <w:t>{{ NOMBRE_PARTS_SOCIALES }}</w:t>
       </w:r>
       <w:r>
         <w:rPr>
@@ -877,7 +773,7 @@
           <w:sz w:val="18"/>
           <w:szCs w:val="18"/>
         </w:rPr>
-        <w:t>{{CIVILITE_ASSOCIE}}</w:t>
+        <w:t>{{ CIVILITE_ASSOCIE }}</w:t>
       </w:r>
       <w:r>
         <w:rPr>
@@ -895,7 +791,7 @@
           <w:sz w:val="18"/>
           <w:szCs w:val="18"/>
         </w:rPr>
-        <w:t>{{PRENOM_ASSOCIE}}</w:t>
+        <w:t>{{ PRENOM_ASSOCIE }}</w:t>
       </w:r>
       <w:r>
         <w:rPr>
@@ -913,7 +809,7 @@
           <w:sz w:val="18"/>
           <w:szCs w:val="18"/>
         </w:rPr>
-        <w:t>{{NOM_ASSOCIE}}</w:t>
+        <w:t>{{ NOM_ASSOCIE }}</w:t>
       </w:r>
       <w:r>
         <w:rPr>
@@ -976,7 +872,7 @@
           <w:sz w:val="18"/>
           <w:szCs w:val="18"/>
         </w:rPr>
-        <w:t>{{NOMBRE_PARTS_SOCIALES}}</w:t>
+        <w:t>{{ NOMBRE_PARTS_SOCIALES }}</w:t>
       </w:r>
       <w:r>
         <w:rPr>
@@ -1079,7 +975,7 @@
           <w:sz w:val="18"/>
           <w:szCs w:val="18"/>
         </w:rPr>
-        <w:t>{{NOMBRE_PARTS_SOCIALES}}</w:t>
+        <w:t>{{ NOMBRE_PARTS_SOCIALES }}</w:t>
       </w:r>
       <w:r>
         <w:rPr>
@@ -1177,7 +1073,7 @@
           <w:sz w:val="18"/>
           <w:szCs w:val="18"/>
         </w:rPr>
-        <w:t>{{CIVILITE_ASSOCIE}} {{PRENOM_ASSOCIE}} {{NOM_ASSOCIE}}</w:t>
+        <w:t>{{ CIVILITE_ASSOCIE }} {{ PRENOM_ASSOCIE }} {{ NOM_ASSOCIE }}</w:t>
       </w:r>
       <w:r>
         <w:rPr>
@@ -1426,7 +1322,7 @@
           <w:sz w:val="18"/>
           <w:szCs w:val="18"/>
         </w:rPr>
-        <w:t>{{NUM_DEPOT_RC}}</w:t>
+        <w:t>{{ NUM_DEPOT_RC }}</w:t>
       </w:r>
       <w:r>
         <w:rPr>
@@ -1489,7 +1385,7 @@
           <w:sz w:val="18"/>
           <w:szCs w:val="18"/>
         </w:rPr>
-        <w:t>{{NUM_RC}}</w:t>
+        <w:t>{{ NUM_RC }}</w:t>
       </w:r>
       <w:r>
         <w:rPr>
@@ -1525,7 +1421,7 @@
           <w:sz w:val="18"/>
           <w:szCs w:val="18"/>
         </w:rPr>
-        <w:t>{{DTAE_CONTRAT}}</w:t>
+        <w:t>{{ DTAE_CONTRAT }}</w:t>
       </w:r>
       <w:r>
         <w:rPr>

</xml_diff>

<commit_message>
feat: update domiciliation workflow and dashboard
</commit_message>
<xml_diff>
--- a/Models/2026-03_Annonce-Legale-Journal_Template.docx
+++ b/Models/2026-03_Annonce-Legale-Journal_Template.docx
@@ -1,6 +1,6 @@
 
 <file path=word/document.xml><?xml version="1.0" encoding="utf-8"?>
-<w:document xmlns:wpc="http://schemas.microsoft.com/office/word/2010/wordprocessingCanvas" xmlns:cx="http://schemas.microsoft.com/office/drawing/2014/chartex" xmlns:cx1="http://schemas.microsoft.com/office/drawing/2015/9/8/chartex" xmlns:cx2="http://schemas.microsoft.com/office/drawing/2015/10/21/chartex" xmlns:cx3="http://schemas.microsoft.com/office/drawing/2016/5/9/chartex" xmlns:cx4="http://schemas.microsoft.com/office/drawing/2016/5/10/chartex" xmlns:cx5="http://schemas.microsoft.com/office/drawing/2016/5/11/chartex" xmlns:cx6="http://schemas.microsoft.com/office/drawing/2016/5/12/chartex" xmlns:cx7="http://schemas.microsoft.com/office/drawing/2016/5/13/chartex" xmlns:cx8="http://schemas.microsoft.com/office/drawing/2016/5/14/chartex" xmlns:mc="http://schemas.openxmlformats.org/markup-compatibility/2006" xmlns:aink="http://schemas.microsoft.com/office/drawing/2016/ink" xmlns:am3d="http://schemas.microsoft.com/office/drawing/2017/model3d" xmlns:o="urn:schemas-microsoft-com:office:office" xmlns:oel="http://schemas.microsoft.com/office/2019/extlst" xmlns:r="http://schemas.openxmlformats.org/officeDocument/2006/relationships" xmlns:m="http://schemas.openxmlformats.org/officeDocument/2006/math" xmlns:v="urn:schemas-microsoft-com:vml" xmlns:wp14="http://schemas.microsoft.com/office/word/2010/wordprocessingDrawing" xmlns:wp="http://schemas.openxmlformats.org/drawingml/2006/wordprocessingDrawing" xmlns:w10="urn:schemas-microsoft-com:office:word" xmlns:w="http://schemas.openxmlformats.org/wordprocessingml/2006/main" xmlns:w14="http://schemas.microsoft.com/office/word/2010/wordml" xmlns:w15="http://schemas.microsoft.com/office/word/2012/wordml" xmlns:w16cex="http://schemas.microsoft.com/office/word/2018/wordml/cex" xmlns:w16cid="http://schemas.microsoft.com/office/word/2016/wordml/cid" xmlns:w16="http://schemas.microsoft.com/office/word/2018/wordml" xmlns:w16sdtdh="http://schemas.microsoft.com/office/word/2020/wordml/sdtdatahash" xmlns:w16se="http://schemas.microsoft.com/office/word/2015/wordml/symex" xmlns:wpg="http://schemas.microsoft.com/office/word/2010/wordprocessingGroup" xmlns:wpi="http://schemas.microsoft.com/office/word/2010/wordprocessingInk" xmlns:wne="http://schemas.microsoft.com/office/word/2006/wordml" xmlns:wps="http://schemas.microsoft.com/office/word/2010/wordprocessingShape" mc:Ignorable="w14 w15 w16se w16cid w16 w16cex w16sdtdh wp14">
+<w:document xmlns:wpc="http://schemas.microsoft.com/office/word/2010/wordprocessingCanvas" xmlns:cx="http://schemas.microsoft.com/office/drawing/2014/chartex" xmlns:cx1="http://schemas.microsoft.com/office/drawing/2015/9/8/chartex" xmlns:cx2="http://schemas.microsoft.com/office/drawing/2015/10/21/chartex" xmlns:cx3="http://schemas.microsoft.com/office/drawing/2016/5/9/chartex" xmlns:cx4="http://schemas.microsoft.com/office/drawing/2016/5/10/chartex" xmlns:cx5="http://schemas.microsoft.com/office/drawing/2016/5/11/chartex" xmlns:cx6="http://schemas.microsoft.com/office/drawing/2016/5/12/chartex" xmlns:cx7="http://schemas.microsoft.com/office/drawing/2016/5/13/chartex" xmlns:cx8="http://schemas.microsoft.com/office/drawing/2016/5/14/chartex" xmlns:mc="http://schemas.openxmlformats.org/markup-compatibility/2006" xmlns:aink="http://schemas.microsoft.com/office/drawing/2016/ink" xmlns:am3d="http://schemas.microsoft.com/office/drawing/2017/model3d" xmlns:o="urn:schemas-microsoft-com:office:office" xmlns:oel="http://schemas.microsoft.com/office/2019/extlst" xmlns:r="http://schemas.openxmlformats.org/officeDocument/2006/relationships" xmlns:m="http://schemas.openxmlformats.org/officeDocument/2006/math" xmlns:v="urn:schemas-microsoft-com:vml" xmlns:wp14="http://schemas.microsoft.com/office/word/2010/wordprocessingDrawing" xmlns:wp="http://schemas.openxmlformats.org/drawingml/2006/wordprocessingDrawing" xmlns:w10="urn:schemas-microsoft-com:office:word" xmlns:w="http://schemas.openxmlformats.org/wordprocessingml/2006/main" xmlns:w14="http://schemas.microsoft.com/office/word/2010/wordml" xmlns:w15="http://schemas.microsoft.com/office/word/2012/wordml" xmlns:w16cex="http://schemas.microsoft.com/office/word/2018/wordml/cex" xmlns:w16cid="http://schemas.microsoft.com/office/word/2016/wordml/cid" xmlns:w16="http://schemas.microsoft.com/office/word/2018/wordml" xmlns:w16du="http://schemas.microsoft.com/office/word/2023/wordml/word16du" xmlns:w16sdtdh="http://schemas.microsoft.com/office/word/2020/wordml/sdtdatahash" xmlns:w16sdtfl="http://schemas.microsoft.com/office/word/2024/wordml/sdtformatlock" xmlns:w16se="http://schemas.microsoft.com/office/word/2015/wordml/symex" xmlns:wpg="http://schemas.microsoft.com/office/word/2010/wordprocessingGroup" xmlns:wpi="http://schemas.microsoft.com/office/word/2010/wordprocessingInk" xmlns:wne="http://schemas.microsoft.com/office/word/2006/wordml" xmlns:wps="http://schemas.microsoft.com/office/word/2010/wordprocessingShape" mc:Ignorable="w14 w15 w16se w16cid w16 w16cex w16sdtdh w16sdtfl w16du wp14">
   <w:body>
     <w:p>
       <w:pPr>
@@ -9,13 +9,15 @@
         </w:tabs>
         <w:jc w:val="center"/>
         <w:rPr>
-          <w:b/>
-          <w:sz w:val="18"/>
-          <w:szCs w:val="18"/>
-        </w:rPr>
-      </w:pPr>
-      <w:r>
-        <w:rPr>
+          <w:rFonts w:asciiTheme="minorHAnsi" w:hAnsiTheme="minorHAnsi" w:cstheme="minorHAnsi"/>
+          <w:b/>
+          <w:sz w:val="18"/>
+          <w:szCs w:val="18"/>
+        </w:rPr>
+      </w:pPr>
+      <w:r>
+        <w:rPr>
+          <w:rFonts w:asciiTheme="minorHAnsi" w:hAnsiTheme="minorHAnsi" w:cstheme="minorHAnsi"/>
           <w:b/>
           <w:sz w:val="18"/>
           <w:szCs w:val="18"/>
@@ -30,13 +32,15 @@
         </w:tabs>
         <w:jc w:val="center"/>
         <w:rPr>
-          <w:b/>
-          <w:sz w:val="18"/>
-          <w:szCs w:val="18"/>
-        </w:rPr>
-      </w:pPr>
-      <w:r>
-        <w:rPr>
+          <w:rFonts w:asciiTheme="minorHAnsi" w:hAnsiTheme="minorHAnsi" w:cstheme="minorHAnsi"/>
+          <w:b/>
+          <w:sz w:val="18"/>
+          <w:szCs w:val="18"/>
+        </w:rPr>
+      </w:pPr>
+      <w:r>
+        <w:rPr>
+          <w:rFonts w:asciiTheme="minorHAnsi" w:hAnsiTheme="minorHAnsi" w:cstheme="minorHAnsi"/>
           <w:b/>
           <w:sz w:val="18"/>
           <w:szCs w:val="18"/>
@@ -45,34 +49,100 @@
       </w:r>
       <w:r>
         <w:rPr>
+          <w:rFonts w:asciiTheme="minorHAnsi" w:hAnsiTheme="minorHAnsi" w:cstheme="minorHAnsi"/>
           <w:b/>
           <w:sz w:val="18"/>
           <w:szCs w:val="18"/>
         </w:rPr>
         <w:t xml:space="preserve"> </w:t>
       </w:r>
-      <w:r>
-        <w:rPr>
-          <w:b/>
-          <w:sz w:val="18"/>
-          <w:szCs w:val="18"/>
-        </w:rPr>
-        <w:t>{{ DENOMINATION_SOCIALE }} {{ FORME_JURIDIQUE }}</w:t>
-      </w:r>
-      <w:r>
-        <w:rPr>
+      <w:proofErr w:type="gramStart"/>
+      <w:r>
+        <w:rPr>
+          <w:rFonts w:asciiTheme="minorHAnsi" w:hAnsiTheme="minorHAnsi" w:cstheme="minorHAnsi"/>
+          <w:b/>
+          <w:sz w:val="18"/>
+          <w:szCs w:val="18"/>
+        </w:rPr>
+        <w:t>{{ DENOMINATION</w:t>
+      </w:r>
+      <w:proofErr w:type="gramEnd"/>
+      <w:r>
+        <w:rPr>
+          <w:rFonts w:asciiTheme="minorHAnsi" w:hAnsiTheme="minorHAnsi" w:cstheme="minorHAnsi"/>
+          <w:b/>
+          <w:sz w:val="18"/>
+          <w:szCs w:val="18"/>
+        </w:rPr>
+        <w:t>_</w:t>
+      </w:r>
+      <w:proofErr w:type="gramStart"/>
+      <w:r>
+        <w:rPr>
+          <w:rFonts w:asciiTheme="minorHAnsi" w:hAnsiTheme="minorHAnsi" w:cstheme="minorHAnsi"/>
+          <w:b/>
+          <w:sz w:val="18"/>
+          <w:szCs w:val="18"/>
+        </w:rPr>
+        <w:t>SOCIALE }</w:t>
+      </w:r>
+      <w:proofErr w:type="gramEnd"/>
+      <w:r>
+        <w:rPr>
+          <w:rFonts w:asciiTheme="minorHAnsi" w:hAnsiTheme="minorHAnsi" w:cstheme="minorHAnsi"/>
+          <w:b/>
+          <w:sz w:val="18"/>
+          <w:szCs w:val="18"/>
+        </w:rPr>
+        <w:t xml:space="preserve">} </w:t>
+      </w:r>
+      <w:proofErr w:type="gramStart"/>
+      <w:r>
+        <w:rPr>
+          <w:rFonts w:asciiTheme="minorHAnsi" w:hAnsiTheme="minorHAnsi" w:cstheme="minorHAnsi"/>
+          <w:b/>
+          <w:sz w:val="18"/>
+          <w:szCs w:val="18"/>
+        </w:rPr>
+        <w:t>{{ FORME</w:t>
+      </w:r>
+      <w:proofErr w:type="gramEnd"/>
+      <w:r>
+        <w:rPr>
+          <w:rFonts w:asciiTheme="minorHAnsi" w:hAnsiTheme="minorHAnsi" w:cstheme="minorHAnsi"/>
+          <w:b/>
+          <w:sz w:val="18"/>
+          <w:szCs w:val="18"/>
+        </w:rPr>
+        <w:t>_</w:t>
+      </w:r>
+      <w:proofErr w:type="gramStart"/>
+      <w:r>
+        <w:rPr>
+          <w:rFonts w:asciiTheme="minorHAnsi" w:hAnsiTheme="minorHAnsi" w:cstheme="minorHAnsi"/>
+          <w:b/>
+          <w:sz w:val="18"/>
+          <w:szCs w:val="18"/>
+        </w:rPr>
+        <w:t>JURIDIQUE }}</w:t>
+      </w:r>
+      <w:r>
+        <w:rPr>
+          <w:rFonts w:asciiTheme="minorHAnsi" w:hAnsiTheme="minorHAnsi" w:cstheme="minorHAnsi"/>
           <w:b/>
           <w:sz w:val="18"/>
           <w:szCs w:val="18"/>
         </w:rPr>
         <w:t>"</w:t>
       </w:r>
+      <w:proofErr w:type="gramEnd"/>
     </w:p>
     <w:p>
       <w:pPr>
         <w:ind w:left="-142"/>
         <w:jc w:val="both"/>
         <w:rPr>
+          <w:rFonts w:asciiTheme="minorHAnsi" w:hAnsiTheme="minorHAnsi" w:cstheme="minorHAnsi"/>
           <w:b/>
           <w:sz w:val="18"/>
           <w:szCs w:val="18"/>
@@ -84,15 +154,15 @@
       <w:pPr>
         <w:jc w:val="both"/>
         <w:rPr>
-          <w:rFonts w:asciiTheme="majorBidi" w:hAnsiTheme="majorBidi" w:cstheme="majorBidi"/>
-          <w:bCs/>
-          <w:sz w:val="18"/>
-          <w:szCs w:val="18"/>
-        </w:rPr>
-      </w:pPr>
-      <w:r>
-        <w:rPr>
-          <w:rFonts w:asciiTheme="majorBidi" w:hAnsiTheme="majorBidi" w:cstheme="majorBidi"/>
+          <w:rFonts w:asciiTheme="minorHAnsi" w:hAnsiTheme="minorHAnsi" w:cstheme="minorHAnsi"/>
+          <w:bCs/>
+          <w:sz w:val="18"/>
+          <w:szCs w:val="18"/>
+        </w:rPr>
+      </w:pPr>
+      <w:r>
+        <w:rPr>
+          <w:rFonts w:asciiTheme="minorHAnsi" w:hAnsiTheme="minorHAnsi" w:cstheme="minorHAnsi"/>
           <w:b/>
           <w:sz w:val="18"/>
           <w:szCs w:val="18"/>
@@ -101,7 +171,7 @@
       </w:r>
       <w:r>
         <w:rPr>
-          <w:rFonts w:asciiTheme="majorBidi" w:hAnsiTheme="majorBidi" w:cstheme="majorBidi"/>
+          <w:rFonts w:asciiTheme="minorHAnsi" w:hAnsiTheme="minorHAnsi" w:cstheme="minorHAnsi"/>
           <w:bCs/>
           <w:sz w:val="18"/>
           <w:szCs w:val="18"/>
@@ -110,7 +180,7 @@
       </w:r>
       <w:r>
         <w:rPr>
-          <w:rFonts w:asciiTheme="majorBidi" w:hAnsiTheme="majorBidi" w:cstheme="majorBidi"/>
+          <w:rFonts w:asciiTheme="minorHAnsi" w:hAnsiTheme="minorHAnsi" w:cstheme="minorHAnsi"/>
           <w:bCs/>
           <w:sz w:val="18"/>
           <w:szCs w:val="18"/>
@@ -119,7 +189,7 @@
       </w:r>
       <w:r>
         <w:rPr>
-          <w:rFonts w:asciiTheme="majorBidi" w:hAnsiTheme="majorBidi" w:cstheme="majorBidi"/>
+          <w:rFonts w:asciiTheme="minorHAnsi" w:hAnsiTheme="minorHAnsi" w:cstheme="minorHAnsi"/>
           <w:bCs/>
           <w:sz w:val="18"/>
           <w:szCs w:val="18"/>
@@ -128,25 +198,56 @@
       </w:r>
       <w:r>
         <w:rPr>
-          <w:rFonts w:asciiTheme="majorBidi" w:hAnsiTheme="majorBidi" w:cstheme="majorBidi"/>
+          <w:rFonts w:asciiTheme="minorHAnsi" w:hAnsiTheme="minorHAnsi" w:cstheme="minorHAnsi"/>
           <w:bCs/>
           <w:sz w:val="18"/>
           <w:szCs w:val="18"/>
         </w:rPr>
         <w:t xml:space="preserve"> </w:t>
       </w:r>
-      <w:r>
-        <w:rPr>
-          <w:rFonts w:asciiTheme="majorBidi" w:hAnsiTheme="majorBidi" w:cstheme="majorBidi"/>
-          <w:b/>
-          <w:sz w:val="18"/>
-          <w:szCs w:val="18"/>
-        </w:rPr>
-        <w:t>{{ DTAE_CONTRAT }}</w:t>
-      </w:r>
-      <w:r>
-        <w:rPr>
-          <w:rFonts w:asciiTheme="majorBidi" w:hAnsiTheme="majorBidi" w:cstheme="majorBidi"/>
+      <w:proofErr w:type="gramStart"/>
+      <w:r>
+        <w:rPr>
+          <w:rFonts w:asciiTheme="minorHAnsi" w:hAnsiTheme="minorHAnsi" w:cstheme="minorHAnsi"/>
+          <w:b/>
+          <w:sz w:val="18"/>
+          <w:szCs w:val="18"/>
+        </w:rPr>
+        <w:t>{{ DTAE</w:t>
+      </w:r>
+      <w:proofErr w:type="gramEnd"/>
+      <w:r>
+        <w:rPr>
+          <w:rFonts w:asciiTheme="minorHAnsi" w:hAnsiTheme="minorHAnsi" w:cstheme="minorHAnsi"/>
+          <w:b/>
+          <w:sz w:val="18"/>
+          <w:szCs w:val="18"/>
+        </w:rPr>
+        <w:t>_</w:t>
+      </w:r>
+      <w:proofErr w:type="gramStart"/>
+      <w:r>
+        <w:rPr>
+          <w:rFonts w:asciiTheme="minorHAnsi" w:hAnsiTheme="minorHAnsi" w:cstheme="minorHAnsi"/>
+          <w:b/>
+          <w:sz w:val="18"/>
+          <w:szCs w:val="18"/>
+        </w:rPr>
+        <w:t>CONTRAT }</w:t>
+      </w:r>
+      <w:proofErr w:type="gramEnd"/>
+      <w:r>
+        <w:rPr>
+          <w:rFonts w:asciiTheme="minorHAnsi" w:hAnsiTheme="minorHAnsi" w:cstheme="minorHAnsi"/>
+          <w:b/>
+          <w:sz w:val="18"/>
+          <w:szCs w:val="18"/>
+        </w:rPr>
+        <w:t>}</w:t>
+      </w:r>
+      <w:r>
+        <w:rPr>
+          <w:rFonts w:asciiTheme="minorHAnsi" w:hAnsiTheme="minorHAnsi" w:cstheme="minorHAnsi"/>
           <w:b/>
           <w:sz w:val="18"/>
           <w:szCs w:val="18"/>
@@ -155,7 +256,7 @@
       </w:r>
       <w:r>
         <w:rPr>
-          <w:rFonts w:asciiTheme="majorBidi" w:hAnsiTheme="majorBidi" w:cstheme="majorBidi"/>
+          <w:rFonts w:asciiTheme="minorHAnsi" w:hAnsiTheme="minorHAnsi" w:cstheme="minorHAnsi"/>
           <w:bCs/>
           <w:sz w:val="18"/>
           <w:szCs w:val="18"/>
@@ -164,7 +265,7 @@
       </w:r>
       <w:r>
         <w:rPr>
-          <w:rFonts w:asciiTheme="majorBidi" w:hAnsiTheme="majorBidi" w:cstheme="majorBidi"/>
+          <w:rFonts w:asciiTheme="minorHAnsi" w:hAnsiTheme="minorHAnsi" w:cstheme="minorHAnsi"/>
           <w:bCs/>
           <w:sz w:val="18"/>
           <w:szCs w:val="18"/>
@@ -173,7 +274,7 @@
       </w:r>
       <w:r>
         <w:rPr>
-          <w:rFonts w:asciiTheme="majorBidi" w:hAnsiTheme="majorBidi" w:cstheme="majorBidi"/>
+          <w:rFonts w:asciiTheme="minorHAnsi" w:hAnsiTheme="minorHAnsi" w:cstheme="minorHAnsi"/>
           <w:bCs/>
           <w:sz w:val="18"/>
           <w:szCs w:val="18"/>
@@ -182,43 +283,56 @@
       </w:r>
       <w:r>
         <w:rPr>
-          <w:rFonts w:asciiTheme="majorBidi" w:hAnsiTheme="majorBidi" w:cstheme="majorBidi"/>
-          <w:bCs/>
-          <w:sz w:val="18"/>
-          <w:szCs w:val="18"/>
-        </w:rPr>
-        <w:t xml:space="preserve"> Statuts </w:t>
-      </w:r>
-      <w:r>
-        <w:rPr>
-          <w:rFonts w:asciiTheme="majorBidi" w:hAnsiTheme="majorBidi" w:cstheme="majorBidi"/>
-          <w:bCs/>
-          <w:sz w:val="18"/>
-          <w:szCs w:val="18"/>
-        </w:rPr>
-        <w:t xml:space="preserve">d’une </w:t>
-      </w:r>
-      <w:r>
-        <w:rPr>
-          <w:rFonts w:asciiTheme="majorBidi" w:hAnsiTheme="majorBidi" w:cstheme="majorBidi"/>
-          <w:bCs/>
-          <w:sz w:val="18"/>
-          <w:szCs w:val="18"/>
-        </w:rPr>
-        <w:t>{{ FORME_JURIDIQUE }}</w:t>
-      </w:r>
-      <w:r>
-        <w:rPr>
-          <w:rFonts w:asciiTheme="majorBidi" w:hAnsiTheme="majorBidi" w:cstheme="majorBidi"/>
-          <w:bCs/>
-          <w:sz w:val="18"/>
-          <w:szCs w:val="18"/>
-        </w:rPr>
-        <w:t xml:space="preserve"> </w:t>
-      </w:r>
-      <w:r>
-        <w:rPr>
-          <w:rFonts w:asciiTheme="majorBidi" w:hAnsiTheme="majorBidi" w:cstheme="majorBidi"/>
+          <w:rFonts w:asciiTheme="minorHAnsi" w:hAnsiTheme="minorHAnsi" w:cstheme="minorHAnsi"/>
+          <w:bCs/>
+          <w:sz w:val="18"/>
+          <w:szCs w:val="18"/>
+        </w:rPr>
+        <w:t xml:space="preserve"> Statuts d’une </w:t>
+      </w:r>
+      <w:proofErr w:type="gramStart"/>
+      <w:r>
+        <w:rPr>
+          <w:rFonts w:asciiTheme="minorHAnsi" w:hAnsiTheme="minorHAnsi" w:cstheme="minorHAnsi"/>
+          <w:bCs/>
+          <w:sz w:val="18"/>
+          <w:szCs w:val="18"/>
+        </w:rPr>
+        <w:t>{{ FORME</w:t>
+      </w:r>
+      <w:proofErr w:type="gramEnd"/>
+      <w:r>
+        <w:rPr>
+          <w:rFonts w:asciiTheme="minorHAnsi" w:hAnsiTheme="minorHAnsi" w:cstheme="minorHAnsi"/>
+          <w:bCs/>
+          <w:sz w:val="18"/>
+          <w:szCs w:val="18"/>
+        </w:rPr>
+        <w:t>_</w:t>
+      </w:r>
+      <w:proofErr w:type="gramStart"/>
+      <w:r>
+        <w:rPr>
+          <w:rFonts w:asciiTheme="minorHAnsi" w:hAnsiTheme="minorHAnsi" w:cstheme="minorHAnsi"/>
+          <w:bCs/>
+          <w:sz w:val="18"/>
+          <w:szCs w:val="18"/>
+        </w:rPr>
+        <w:t>JURIDIQUE }</w:t>
+      </w:r>
+      <w:proofErr w:type="gramEnd"/>
+      <w:r>
+        <w:rPr>
+          <w:rFonts w:asciiTheme="minorHAnsi" w:hAnsiTheme="minorHAnsi" w:cstheme="minorHAnsi"/>
+          <w:bCs/>
+          <w:sz w:val="18"/>
+          <w:szCs w:val="18"/>
+        </w:rPr>
+        <w:t xml:space="preserve">} </w:t>
+      </w:r>
+      <w:r>
+        <w:rPr>
+          <w:rFonts w:asciiTheme="minorHAnsi" w:hAnsiTheme="minorHAnsi" w:cstheme="minorHAnsi"/>
           <w:bCs/>
           <w:sz w:val="18"/>
           <w:szCs w:val="18"/>
@@ -227,7 +341,7 @@
       </w:r>
       <w:r>
         <w:rPr>
-          <w:rFonts w:asciiTheme="majorBidi" w:hAnsiTheme="majorBidi" w:cstheme="majorBidi"/>
+          <w:rFonts w:asciiTheme="minorHAnsi" w:hAnsiTheme="minorHAnsi" w:cstheme="minorHAnsi"/>
           <w:bCs/>
           <w:sz w:val="18"/>
           <w:szCs w:val="18"/>
@@ -245,15 +359,15 @@
         <w:ind w:left="567"/>
         <w:jc w:val="both"/>
         <w:rPr>
-          <w:rFonts w:asciiTheme="majorBidi" w:hAnsiTheme="majorBidi" w:cstheme="majorBidi"/>
-          <w:bCs/>
-          <w:sz w:val="18"/>
-          <w:szCs w:val="18"/>
-        </w:rPr>
-      </w:pPr>
-      <w:r>
-        <w:rPr>
-          <w:rFonts w:asciiTheme="majorBidi" w:hAnsiTheme="majorBidi" w:cstheme="majorBidi"/>
+          <w:rFonts w:asciiTheme="minorHAnsi" w:hAnsiTheme="minorHAnsi" w:cstheme="minorHAnsi"/>
+          <w:bCs/>
+          <w:sz w:val="18"/>
+          <w:szCs w:val="18"/>
+        </w:rPr>
+      </w:pPr>
+      <w:r>
+        <w:rPr>
+          <w:rFonts w:asciiTheme="minorHAnsi" w:hAnsiTheme="minorHAnsi" w:cstheme="minorHAnsi"/>
           <w:b/>
           <w:bCs/>
           <w:sz w:val="18"/>
@@ -263,24 +377,47 @@
       </w:r>
       <w:r>
         <w:rPr>
+          <w:rFonts w:asciiTheme="minorHAnsi" w:hAnsiTheme="minorHAnsi" w:cstheme="minorHAnsi"/>
           <w:sz w:val="18"/>
           <w:szCs w:val="18"/>
         </w:rPr>
         <w:t>« </w:t>
       </w:r>
-      <w:r>
-        <w:rPr>
-          <w:sz w:val="18"/>
-          <w:szCs w:val="18"/>
-        </w:rPr>
-        <w:t>{{ DENOMINATION_SOCIALE }}</w:t>
-      </w:r>
-      <w:r>
-        <w:rPr>
-          <w:sz w:val="18"/>
-          <w:szCs w:val="18"/>
-        </w:rPr>
-        <w:t> »</w:t>
+      <w:proofErr w:type="gramStart"/>
+      <w:r>
+        <w:rPr>
+          <w:rFonts w:asciiTheme="minorHAnsi" w:hAnsiTheme="minorHAnsi" w:cstheme="minorHAnsi"/>
+          <w:sz w:val="18"/>
+          <w:szCs w:val="18"/>
+        </w:rPr>
+        <w:t>{{ DENOMINATION</w:t>
+      </w:r>
+      <w:proofErr w:type="gramEnd"/>
+      <w:r>
+        <w:rPr>
+          <w:rFonts w:asciiTheme="minorHAnsi" w:hAnsiTheme="minorHAnsi" w:cstheme="minorHAnsi"/>
+          <w:sz w:val="18"/>
+          <w:szCs w:val="18"/>
+        </w:rPr>
+        <w:t>_</w:t>
+      </w:r>
+      <w:proofErr w:type="gramStart"/>
+      <w:r>
+        <w:rPr>
+          <w:rFonts w:asciiTheme="minorHAnsi" w:hAnsiTheme="minorHAnsi" w:cstheme="minorHAnsi"/>
+          <w:sz w:val="18"/>
+          <w:szCs w:val="18"/>
+        </w:rPr>
+        <w:t>SOCIALE }</w:t>
+      </w:r>
+      <w:proofErr w:type="gramEnd"/>
+      <w:r>
+        <w:rPr>
+          <w:rFonts w:asciiTheme="minorHAnsi" w:hAnsiTheme="minorHAnsi" w:cstheme="minorHAnsi"/>
+          <w:sz w:val="18"/>
+          <w:szCs w:val="18"/>
+        </w:rPr>
+        <w:t>} »</w:t>
       </w:r>
     </w:p>
     <w:p>
@@ -293,149 +430,123 @@
         <w:ind w:left="567"/>
         <w:jc w:val="both"/>
         <w:rPr>
-          <w:rFonts w:asciiTheme="majorBidi" w:hAnsiTheme="majorBidi" w:cstheme="majorBidi"/>
-          <w:bCs/>
-          <w:sz w:val="18"/>
-          <w:szCs w:val="18"/>
-        </w:rPr>
-      </w:pPr>
-      <w:r>
-        <w:rPr>
-          <w:rFonts w:asciiTheme="majorBidi" w:hAnsiTheme="majorBidi" w:cstheme="majorBidi"/>
-          <w:b/>
-          <w:sz w:val="18"/>
-          <w:szCs w:val="18"/>
+          <w:rFonts w:asciiTheme="minorHAnsi" w:hAnsiTheme="minorHAnsi" w:cstheme="minorHAnsi"/>
+          <w:b/>
+          <w:sz w:val="18"/>
+          <w:szCs w:val="18"/>
+          <w:lang w:val="en-US"/>
+        </w:rPr>
+      </w:pPr>
+      <w:proofErr w:type="spellStart"/>
+      <w:r>
+        <w:rPr>
+          <w:rFonts w:asciiTheme="minorHAnsi" w:hAnsiTheme="minorHAnsi" w:cstheme="minorHAnsi"/>
+          <w:b/>
+          <w:sz w:val="18"/>
+          <w:szCs w:val="18"/>
+          <w:lang w:val="en-US"/>
         </w:rPr>
         <w:t>Objet</w:t>
       </w:r>
-      <w:r>
-        <w:rPr>
-          <w:rFonts w:asciiTheme="majorBidi" w:hAnsiTheme="majorBidi" w:cstheme="majorBidi"/>
-          <w:bCs/>
-          <w:sz w:val="18"/>
-          <w:szCs w:val="18"/>
+      <w:proofErr w:type="spellEnd"/>
+      <w:r>
+        <w:rPr>
+          <w:rFonts w:asciiTheme="minorHAnsi" w:hAnsiTheme="minorHAnsi" w:cstheme="minorHAnsi"/>
+          <w:bCs/>
+          <w:sz w:val="18"/>
+          <w:szCs w:val="18"/>
+          <w:lang w:val="en-US"/>
         </w:rPr>
         <w:t> </w:t>
       </w:r>
       <w:r>
         <w:rPr>
-          <w:rFonts w:asciiTheme="majorBidi" w:hAnsiTheme="majorBidi" w:cstheme="majorBidi"/>
-          <w:b/>
-          <w:sz w:val="18"/>
-          <w:szCs w:val="18"/>
+          <w:rFonts w:asciiTheme="minorHAnsi" w:hAnsiTheme="minorHAnsi" w:cstheme="minorHAnsi"/>
+          <w:b/>
+          <w:sz w:val="18"/>
+          <w:szCs w:val="18"/>
+          <w:lang w:val="en-US"/>
         </w:rPr>
         <w:t xml:space="preserve">: </w:t>
       </w:r>
       <w:r>
         <w:rPr>
-          <w:rFonts w:asciiTheme="majorBidi" w:hAnsiTheme="majorBidi" w:cstheme="majorBidi"/>
-          <w:bCs/>
-          <w:sz w:val="18"/>
-          <w:szCs w:val="18"/>
-        </w:rPr>
-        <w:t>{{ ACTIVITY1 }}</w:t>
-      </w:r>
-      <w:r>
-        <w:rPr>
-          <w:rFonts w:asciiTheme="majorBidi" w:hAnsiTheme="majorBidi" w:cstheme="majorBidi"/>
-          <w:bCs/>
-          <w:sz w:val="18"/>
-          <w:szCs w:val="18"/>
-        </w:rPr>
-        <w:t> ;</w:t>
-      </w:r>
-      <w:r>
+          <w:rFonts w:asciiTheme="minorHAnsi" w:hAnsiTheme="minorHAnsi" w:cstheme="minorHAnsi"/>
+          <w:b/>
+          <w:sz w:val="18"/>
+          <w:szCs w:val="18"/>
+          <w:lang w:val="en-US"/>
+        </w:rPr>
+        <w:t>{%p for a in ACTIVITES_LIST %}</w:t>
+      </w:r>
+      <w:r>
+        <w:rPr>
+          <w:rFonts w:asciiTheme="minorHAnsi" w:hAnsiTheme="minorHAnsi" w:cstheme="minorHAnsi"/>
+          <w:b/>
+          <w:sz w:val="18"/>
+          <w:szCs w:val="18"/>
+          <w:lang w:val="en-US"/>
+        </w:rPr>
         <w:t xml:space="preserve"> </w:t>
       </w:r>
       <w:r>
         <w:rPr>
-          <w:rFonts w:asciiTheme="majorBidi" w:hAnsiTheme="majorBidi" w:cstheme="majorBidi"/>
-          <w:bCs/>
-          <w:sz w:val="18"/>
-          <w:szCs w:val="18"/>
-        </w:rPr>
-        <w:t>{{ ACTIVITY2 }}</w:t>
-      </w:r>
-      <w:r>
-        <w:rPr>
-          <w:rFonts w:asciiTheme="majorBidi" w:hAnsiTheme="majorBidi" w:cstheme="majorBidi"/>
-          <w:bCs/>
-          <w:sz w:val="18"/>
-          <w:szCs w:val="18"/>
-        </w:rPr>
-        <w:t xml:space="preserve"> ; </w:t>
-      </w:r>
-      <w:r>
-        <w:rPr>
-          <w:rFonts w:asciiTheme="majorBidi" w:hAnsiTheme="majorBidi" w:cstheme="majorBidi"/>
-          <w:bCs/>
-          <w:sz w:val="18"/>
-          <w:szCs w:val="18"/>
-        </w:rPr>
-        <w:t>{{ ACTIVITY3 }}</w:t>
-      </w:r>
-      <w:r>
-        <w:rPr>
-          <w:rFonts w:asciiTheme="majorBidi" w:hAnsiTheme="majorBidi" w:cstheme="majorBidi"/>
-          <w:bCs/>
-          <w:sz w:val="18"/>
-          <w:szCs w:val="18"/>
-        </w:rPr>
-        <w:t> ;</w:t>
-      </w:r>
-      <w:r>
+          <w:rFonts w:asciiTheme="minorHAnsi" w:hAnsiTheme="minorHAnsi" w:cstheme="minorHAnsi"/>
+          <w:b/>
+          <w:sz w:val="18"/>
+          <w:szCs w:val="18"/>
+          <w:lang w:val="en-US"/>
+        </w:rPr>
+        <w:t>{{ a }}</w:t>
+      </w:r>
+      <w:r>
+        <w:rPr>
+          <w:rFonts w:asciiTheme="minorHAnsi" w:hAnsiTheme="minorHAnsi" w:cstheme="minorHAnsi"/>
+          <w:b/>
+          <w:sz w:val="18"/>
+          <w:szCs w:val="18"/>
+          <w:lang w:val="en-US"/>
+        </w:rPr>
+        <w:t>,</w:t>
+      </w:r>
+      <w:r>
+        <w:rPr>
+          <w:rFonts w:asciiTheme="minorHAnsi" w:hAnsiTheme="minorHAnsi" w:cstheme="minorHAnsi"/>
+          <w:b/>
+          <w:sz w:val="18"/>
+          <w:szCs w:val="18"/>
+          <w:lang w:val="en-US"/>
+        </w:rPr>
         <w:t xml:space="preserve"> </w:t>
       </w:r>
       <w:r>
         <w:rPr>
-          <w:rFonts w:asciiTheme="majorBidi" w:hAnsiTheme="majorBidi" w:cstheme="majorBidi"/>
-          <w:bCs/>
-          <w:sz w:val="18"/>
-          <w:szCs w:val="18"/>
-        </w:rPr>
-        <w:t>{{ ACTIVITY4 }}</w:t>
-      </w:r>
-      <w:r>
-        <w:rPr>
-          <w:rFonts w:asciiTheme="majorBidi" w:hAnsiTheme="majorBidi" w:cstheme="majorBidi"/>
-          <w:bCs/>
-          <w:sz w:val="18"/>
-          <w:szCs w:val="18"/>
-        </w:rPr>
-        <w:t> ;</w:t>
-      </w:r>
-      <w:r>
-        <w:t xml:space="preserve"> </w:t>
-      </w:r>
-      <w:r>
-        <w:rPr>
-          <w:rFonts w:asciiTheme="majorBidi" w:hAnsiTheme="majorBidi" w:cstheme="majorBidi"/>
-          <w:bCs/>
-          <w:sz w:val="18"/>
-          <w:szCs w:val="18"/>
-        </w:rPr>
-        <w:t>{{ ACTIVITY5 }}</w:t>
-      </w:r>
-      <w:r>
-        <w:rPr>
-          <w:rFonts w:asciiTheme="majorBidi" w:hAnsiTheme="majorBidi" w:cstheme="majorBidi"/>
-          <w:bCs/>
-          <w:sz w:val="18"/>
-          <w:szCs w:val="18"/>
-        </w:rPr>
-        <w:t> ;</w:t>
-      </w:r>
-      <w:r>
-        <w:t xml:space="preserve"> </w:t>
-      </w:r>
-      <w:r>
-        <w:rPr>
-          <w:rFonts w:asciiTheme="majorBidi" w:hAnsiTheme="majorBidi" w:cstheme="majorBidi"/>
-          <w:bCs/>
-          <w:sz w:val="18"/>
-          <w:szCs w:val="18"/>
-        </w:rPr>
-        <w:t>{{ ACTIVITY6 }}</w:t>
+          <w:rFonts w:asciiTheme="minorHAnsi" w:hAnsiTheme="minorHAnsi" w:cstheme="minorHAnsi"/>
+          <w:b/>
+          <w:sz w:val="18"/>
+          <w:szCs w:val="18"/>
+        </w:rPr>
+        <w:t xml:space="preserve">{%p </w:t>
+      </w:r>
+      <w:proofErr w:type="spellStart"/>
+      <w:r>
+        <w:rPr>
+          <w:rFonts w:asciiTheme="minorHAnsi" w:hAnsiTheme="minorHAnsi" w:cstheme="minorHAnsi"/>
+          <w:b/>
+          <w:sz w:val="18"/>
+          <w:szCs w:val="18"/>
+        </w:rPr>
+        <w:t>endfor</w:t>
+      </w:r>
+      <w:proofErr w:type="spellEnd"/>
+      <w:r>
+        <w:rPr>
+          <w:rFonts w:asciiTheme="minorHAnsi" w:hAnsiTheme="minorHAnsi" w:cstheme="minorHAnsi"/>
+          <w:b/>
+          <w:sz w:val="18"/>
+          <w:szCs w:val="18"/>
+        </w:rPr>
+        <w:t xml:space="preserve"> %}</w:t>
       </w:r>
     </w:p>
     <w:p>
@@ -448,15 +559,15 @@
         <w:ind w:left="567"/>
         <w:jc w:val="both"/>
         <w:rPr>
-          <w:rFonts w:asciiTheme="majorBidi" w:hAnsiTheme="majorBidi" w:cstheme="majorBidi"/>
-          <w:bCs/>
-          <w:sz w:val="18"/>
-          <w:szCs w:val="18"/>
-        </w:rPr>
-      </w:pPr>
-      <w:r>
-        <w:rPr>
-          <w:rFonts w:asciiTheme="majorBidi" w:hAnsiTheme="majorBidi" w:cstheme="majorBidi"/>
+          <w:rFonts w:asciiTheme="minorHAnsi" w:hAnsiTheme="minorHAnsi" w:cstheme="minorHAnsi"/>
+          <w:bCs/>
+          <w:sz w:val="18"/>
+          <w:szCs w:val="18"/>
+        </w:rPr>
+      </w:pPr>
+      <w:r>
+        <w:rPr>
+          <w:rFonts w:asciiTheme="minorHAnsi" w:hAnsiTheme="minorHAnsi" w:cstheme="minorHAnsi"/>
           <w:b/>
           <w:sz w:val="18"/>
           <w:szCs w:val="18"/>
@@ -464,29 +575,54 @@
         <w:t>Siège Social :</w:t>
       </w:r>
       <w:r>
+        <w:rPr>
+          <w:rFonts w:asciiTheme="minorHAnsi" w:hAnsiTheme="minorHAnsi" w:cstheme="minorHAnsi"/>
+        </w:rPr>
         <w:t xml:space="preserve"> </w:t>
       </w:r>
-      <w:r>
-        <w:rPr>
-          <w:rFonts w:asciiTheme="majorBidi" w:hAnsiTheme="majorBidi" w:cstheme="majorBidi"/>
-          <w:bCs/>
-          <w:sz w:val="18"/>
-          <w:szCs w:val="18"/>
-        </w:rPr>
-        <w:t>{{ ADRESSE_SIEGE_SOCIAL }}</w:t>
-      </w:r>
-      <w:r>
-        <w:rPr>
-          <w:rFonts w:asciiTheme="majorBidi" w:hAnsiTheme="majorBidi" w:cstheme="majorBidi"/>
-          <w:bCs/>
-          <w:sz w:val="18"/>
-          <w:szCs w:val="18"/>
-        </w:rPr>
-        <w:t xml:space="preserve"> </w:t>
-      </w:r>
-      <w:r>
-        <w:rPr>
-          <w:rFonts w:asciiTheme="majorBidi" w:hAnsiTheme="majorBidi" w:cstheme="majorBidi"/>
+      <w:proofErr w:type="gramStart"/>
+      <w:r>
+        <w:rPr>
+          <w:rFonts w:asciiTheme="minorHAnsi" w:hAnsiTheme="minorHAnsi" w:cstheme="minorHAnsi"/>
+          <w:bCs/>
+          <w:sz w:val="18"/>
+          <w:szCs w:val="18"/>
+        </w:rPr>
+        <w:t>{{ ADRESSE</w:t>
+      </w:r>
+      <w:proofErr w:type="gramEnd"/>
+      <w:r>
+        <w:rPr>
+          <w:rFonts w:asciiTheme="minorHAnsi" w:hAnsiTheme="minorHAnsi" w:cstheme="minorHAnsi"/>
+          <w:bCs/>
+          <w:sz w:val="18"/>
+          <w:szCs w:val="18"/>
+        </w:rPr>
+        <w:t>_SIEGE_</w:t>
+      </w:r>
+      <w:proofErr w:type="gramStart"/>
+      <w:r>
+        <w:rPr>
+          <w:rFonts w:asciiTheme="minorHAnsi" w:hAnsiTheme="minorHAnsi" w:cstheme="minorHAnsi"/>
+          <w:bCs/>
+          <w:sz w:val="18"/>
+          <w:szCs w:val="18"/>
+        </w:rPr>
+        <w:t>SOCIAL }</w:t>
+      </w:r>
+      <w:proofErr w:type="gramEnd"/>
+      <w:r>
+        <w:rPr>
+          <w:rFonts w:asciiTheme="minorHAnsi" w:hAnsiTheme="minorHAnsi" w:cstheme="minorHAnsi"/>
+          <w:bCs/>
+          <w:sz w:val="18"/>
+          <w:szCs w:val="18"/>
+        </w:rPr>
+        <w:t xml:space="preserve">} </w:t>
+      </w:r>
+      <w:r>
+        <w:rPr>
+          <w:rFonts w:asciiTheme="minorHAnsi" w:hAnsiTheme="minorHAnsi" w:cstheme="minorHAnsi"/>
           <w:bCs/>
           <w:sz w:val="18"/>
           <w:szCs w:val="18"/>
@@ -495,7 +631,7 @@
       </w:r>
       <w:r>
         <w:rPr>
-          <w:rFonts w:asciiTheme="majorBidi" w:hAnsiTheme="majorBidi" w:cstheme="majorBidi"/>
+          <w:rFonts w:asciiTheme="minorHAnsi" w:hAnsiTheme="minorHAnsi" w:cstheme="minorHAnsi"/>
           <w:bCs/>
           <w:sz w:val="18"/>
           <w:szCs w:val="18"/>
@@ -513,15 +649,15 @@
         <w:ind w:left="567"/>
         <w:jc w:val="both"/>
         <w:rPr>
-          <w:rFonts w:asciiTheme="majorBidi" w:hAnsiTheme="majorBidi" w:cstheme="majorBidi"/>
-          <w:bCs/>
-          <w:sz w:val="18"/>
-          <w:szCs w:val="18"/>
-        </w:rPr>
-      </w:pPr>
-      <w:r>
-        <w:rPr>
-          <w:rFonts w:asciiTheme="majorBidi" w:hAnsiTheme="majorBidi" w:cstheme="majorBidi"/>
+          <w:rFonts w:asciiTheme="minorHAnsi" w:hAnsiTheme="minorHAnsi" w:cstheme="minorHAnsi"/>
+          <w:bCs/>
+          <w:sz w:val="18"/>
+          <w:szCs w:val="18"/>
+        </w:rPr>
+      </w:pPr>
+      <w:r>
+        <w:rPr>
+          <w:rFonts w:asciiTheme="minorHAnsi" w:hAnsiTheme="minorHAnsi" w:cstheme="minorHAnsi"/>
           <w:b/>
           <w:sz w:val="18"/>
           <w:szCs w:val="18"/>
@@ -530,7 +666,7 @@
       </w:r>
       <w:r>
         <w:rPr>
-          <w:rFonts w:asciiTheme="majorBidi" w:hAnsiTheme="majorBidi" w:cstheme="majorBidi"/>
+          <w:rFonts w:asciiTheme="minorHAnsi" w:hAnsiTheme="minorHAnsi" w:cstheme="minorHAnsi"/>
           <w:bCs/>
           <w:sz w:val="18"/>
           <w:szCs w:val="18"/>
@@ -539,7 +675,7 @@
       </w:r>
       <w:r>
         <w:rPr>
-          <w:rFonts w:asciiTheme="majorBidi" w:hAnsiTheme="majorBidi" w:cstheme="majorBidi"/>
+          <w:rFonts w:asciiTheme="minorHAnsi" w:hAnsiTheme="minorHAnsi" w:cstheme="minorHAnsi"/>
           <w:bCs/>
           <w:sz w:val="18"/>
           <w:szCs w:val="18"/>
@@ -557,15 +693,15 @@
         <w:ind w:left="567"/>
         <w:jc w:val="both"/>
         <w:rPr>
-          <w:rFonts w:asciiTheme="majorBidi" w:hAnsiTheme="majorBidi" w:cstheme="majorBidi"/>
-          <w:bCs/>
-          <w:sz w:val="18"/>
-          <w:szCs w:val="18"/>
-        </w:rPr>
-      </w:pPr>
-      <w:r>
-        <w:rPr>
-          <w:rFonts w:asciiTheme="majorBidi" w:hAnsiTheme="majorBidi" w:cstheme="majorBidi"/>
+          <w:rFonts w:asciiTheme="minorHAnsi" w:hAnsiTheme="minorHAnsi" w:cstheme="minorHAnsi"/>
+          <w:bCs/>
+          <w:sz w:val="18"/>
+          <w:szCs w:val="18"/>
+        </w:rPr>
+      </w:pPr>
+      <w:r>
+        <w:rPr>
+          <w:rFonts w:asciiTheme="minorHAnsi" w:hAnsiTheme="minorHAnsi" w:cstheme="minorHAnsi"/>
           <w:b/>
           <w:sz w:val="18"/>
           <w:szCs w:val="18"/>
@@ -574,7 +710,7 @@
       </w:r>
       <w:r>
         <w:rPr>
-          <w:rFonts w:asciiTheme="majorBidi" w:hAnsiTheme="majorBidi" w:cstheme="majorBidi"/>
+          <w:rFonts w:asciiTheme="minorHAnsi" w:hAnsiTheme="minorHAnsi" w:cstheme="minorHAnsi"/>
           <w:b/>
           <w:sz w:val="18"/>
           <w:szCs w:val="18"/>
@@ -583,25 +719,56 @@
       </w:r>
       <w:r>
         <w:rPr>
-          <w:rFonts w:asciiTheme="majorBidi" w:hAnsiTheme="majorBidi" w:cstheme="majorBidi"/>
+          <w:rFonts w:asciiTheme="minorHAnsi" w:hAnsiTheme="minorHAnsi" w:cstheme="minorHAnsi"/>
           <w:bCs/>
           <w:sz w:val="18"/>
           <w:szCs w:val="18"/>
         </w:rPr>
         <w:t xml:space="preserve">s'élève à </w:t>
       </w:r>
-      <w:r>
-        <w:rPr>
-          <w:rFonts w:asciiTheme="majorBidi" w:hAnsiTheme="majorBidi" w:cstheme="majorBidi"/>
-          <w:bCs/>
-          <w:sz w:val="18"/>
-          <w:szCs w:val="18"/>
-        </w:rPr>
-        <w:t>{{ CAPITAL_SOCIAL }}</w:t>
-      </w:r>
-      <w:r>
-        <w:rPr>
-          <w:rFonts w:asciiTheme="majorBidi" w:hAnsiTheme="majorBidi" w:cstheme="majorBidi"/>
+      <w:proofErr w:type="gramStart"/>
+      <w:r>
+        <w:rPr>
+          <w:rFonts w:asciiTheme="minorHAnsi" w:hAnsiTheme="minorHAnsi" w:cstheme="minorHAnsi"/>
+          <w:bCs/>
+          <w:sz w:val="18"/>
+          <w:szCs w:val="18"/>
+        </w:rPr>
+        <w:t>{{ CAPITAL</w:t>
+      </w:r>
+      <w:proofErr w:type="gramEnd"/>
+      <w:r>
+        <w:rPr>
+          <w:rFonts w:asciiTheme="minorHAnsi" w:hAnsiTheme="minorHAnsi" w:cstheme="minorHAnsi"/>
+          <w:bCs/>
+          <w:sz w:val="18"/>
+          <w:szCs w:val="18"/>
+        </w:rPr>
+        <w:t>_</w:t>
+      </w:r>
+      <w:proofErr w:type="gramStart"/>
+      <w:r>
+        <w:rPr>
+          <w:rFonts w:asciiTheme="minorHAnsi" w:hAnsiTheme="minorHAnsi" w:cstheme="minorHAnsi"/>
+          <w:bCs/>
+          <w:sz w:val="18"/>
+          <w:szCs w:val="18"/>
+        </w:rPr>
+        <w:t>SOCIAL }</w:t>
+      </w:r>
+      <w:proofErr w:type="gramEnd"/>
+      <w:r>
+        <w:rPr>
+          <w:rFonts w:asciiTheme="minorHAnsi" w:hAnsiTheme="minorHAnsi" w:cstheme="minorHAnsi"/>
+          <w:bCs/>
+          <w:sz w:val="18"/>
+          <w:szCs w:val="18"/>
+        </w:rPr>
+        <w:t>}</w:t>
+      </w:r>
+      <w:r>
+        <w:rPr>
+          <w:rFonts w:asciiTheme="minorHAnsi" w:hAnsiTheme="minorHAnsi" w:cstheme="minorHAnsi"/>
           <w:bCs/>
           <w:sz w:val="18"/>
           <w:szCs w:val="18"/>
@@ -610,45 +777,110 @@
       </w:r>
       <w:r>
         <w:rPr>
-          <w:rFonts w:asciiTheme="majorBidi" w:hAnsiTheme="majorBidi" w:cstheme="majorBidi"/>
+          <w:rFonts w:asciiTheme="minorHAnsi" w:hAnsiTheme="minorHAnsi" w:cstheme="minorHAnsi"/>
           <w:bCs/>
           <w:sz w:val="18"/>
           <w:szCs w:val="18"/>
         </w:rPr>
         <w:t xml:space="preserve"> </w:t>
       </w:r>
-      <w:proofErr w:type="spellStart"/>
-      <w:r>
-        <w:rPr>
-          <w:rFonts w:asciiTheme="majorBidi" w:hAnsiTheme="majorBidi" w:cstheme="majorBidi"/>
+      <w:r>
+        <w:rPr>
+          <w:rFonts w:asciiTheme="minorHAnsi" w:hAnsiTheme="minorHAnsi" w:cstheme="minorHAnsi"/>
           <w:bCs/>
           <w:sz w:val="18"/>
           <w:szCs w:val="18"/>
         </w:rPr>
         <w:t>Dhs</w:t>
       </w:r>
-      <w:proofErr w:type="spellEnd"/>
-      <w:r>
-        <w:rPr>
-          <w:rFonts w:asciiTheme="majorBidi" w:hAnsiTheme="majorBidi" w:cstheme="majorBidi"/>
+      <w:r>
+        <w:rPr>
+          <w:rFonts w:asciiTheme="minorHAnsi" w:hAnsiTheme="minorHAnsi" w:cstheme="minorHAnsi"/>
           <w:bCs/>
           <w:sz w:val="18"/>
           <w:szCs w:val="18"/>
         </w:rPr>
         <w:t xml:space="preserve"> divisé en </w:t>
       </w:r>
-      <w:r>
-        <w:rPr>
-          <w:rFonts w:asciiTheme="majorBidi" w:hAnsiTheme="majorBidi" w:cstheme="majorBidi"/>
-          <w:bCs/>
-          <w:sz w:val="18"/>
-          <w:szCs w:val="18"/>
-        </w:rPr>
-        <w:t>{{ NOMBRE_PARTS_SOCIALES }}</w:t>
-      </w:r>
-      <w:r>
-        <w:rPr>
-          <w:rFonts w:asciiTheme="majorBidi" w:hAnsiTheme="majorBidi" w:cstheme="majorBidi"/>
+      <w:proofErr w:type="gramStart"/>
+      <w:r>
+        <w:rPr>
+          <w:rFonts w:asciiTheme="minorHAnsi" w:hAnsiTheme="minorHAnsi" w:cstheme="minorHAnsi"/>
+          <w:bCs/>
+          <w:sz w:val="18"/>
+          <w:szCs w:val="18"/>
+        </w:rPr>
+        <w:t>{{ NOMBRE</w:t>
+      </w:r>
+      <w:proofErr w:type="gramEnd"/>
+      <w:r>
+        <w:rPr>
+          <w:rFonts w:asciiTheme="minorHAnsi" w:hAnsiTheme="minorHAnsi" w:cstheme="minorHAnsi"/>
+          <w:bCs/>
+          <w:sz w:val="18"/>
+          <w:szCs w:val="18"/>
+        </w:rPr>
+        <w:t>_PARTS_</w:t>
+      </w:r>
+      <w:proofErr w:type="gramStart"/>
+      <w:r>
+        <w:rPr>
+          <w:rFonts w:asciiTheme="minorHAnsi" w:hAnsiTheme="minorHAnsi" w:cstheme="minorHAnsi"/>
+          <w:bCs/>
+          <w:sz w:val="18"/>
+          <w:szCs w:val="18"/>
+        </w:rPr>
+        <w:t>SOCIALES }</w:t>
+      </w:r>
+      <w:proofErr w:type="gramEnd"/>
+      <w:r>
+        <w:rPr>
+          <w:rFonts w:asciiTheme="minorHAnsi" w:hAnsiTheme="minorHAnsi" w:cstheme="minorHAnsi"/>
+          <w:bCs/>
+          <w:sz w:val="18"/>
+          <w:szCs w:val="18"/>
+        </w:rPr>
+        <w:t xml:space="preserve">} </w:t>
+      </w:r>
+      <w:r>
+        <w:rPr>
+          <w:rFonts w:asciiTheme="minorHAnsi" w:hAnsiTheme="minorHAnsi" w:cstheme="minorHAnsi"/>
+          <w:bCs/>
+          <w:sz w:val="18"/>
+          <w:szCs w:val="18"/>
+        </w:rPr>
+        <w:t>parts sociales de </w:t>
+      </w:r>
+      <w:r>
+        <w:rPr>
+          <w:rFonts w:asciiTheme="minorHAnsi" w:hAnsiTheme="minorHAnsi" w:cstheme="minorHAnsi"/>
+          <w:bCs/>
+          <w:sz w:val="18"/>
+          <w:szCs w:val="18"/>
+        </w:rPr>
+        <w:t>100</w:t>
+      </w:r>
+      <w:r>
+        <w:rPr>
+          <w:rFonts w:asciiTheme="minorHAnsi" w:hAnsiTheme="minorHAnsi" w:cstheme="minorHAnsi"/>
+          <w:bCs/>
+          <w:sz w:val="18"/>
+          <w:szCs w:val="18"/>
+        </w:rPr>
+        <w:t xml:space="preserve"> DH chacune, attribuées </w:t>
+      </w:r>
+      <w:r>
+        <w:rPr>
+          <w:rFonts w:asciiTheme="minorHAnsi" w:hAnsiTheme="minorHAnsi" w:cstheme="minorHAnsi"/>
+          <w:bCs/>
+          <w:sz w:val="18"/>
+          <w:szCs w:val="18"/>
+        </w:rPr>
+        <w:t>à</w:t>
+      </w:r>
+      <w:r>
+        <w:rPr>
+          <w:rFonts w:asciiTheme="minorHAnsi" w:hAnsiTheme="minorHAnsi" w:cstheme="minorHAnsi"/>
           <w:bCs/>
           <w:sz w:val="18"/>
           <w:szCs w:val="18"/>
@@ -657,43 +889,34 @@
       </w:r>
       <w:r>
         <w:rPr>
-          <w:rFonts w:asciiTheme="majorBidi" w:hAnsiTheme="majorBidi" w:cstheme="majorBidi"/>
-          <w:bCs/>
-          <w:sz w:val="18"/>
-          <w:szCs w:val="18"/>
-        </w:rPr>
-        <w:t>parts sociales de </w:t>
-      </w:r>
-      <w:r>
-        <w:rPr>
-          <w:rFonts w:asciiTheme="majorBidi" w:hAnsiTheme="majorBidi" w:cstheme="majorBidi"/>
-          <w:bCs/>
-          <w:sz w:val="18"/>
-          <w:szCs w:val="18"/>
-        </w:rPr>
-        <w:t>100</w:t>
-      </w:r>
-      <w:r>
-        <w:rPr>
-          <w:rFonts w:asciiTheme="majorBidi" w:hAnsiTheme="majorBidi" w:cstheme="majorBidi"/>
-          <w:bCs/>
-          <w:sz w:val="18"/>
-          <w:szCs w:val="18"/>
-        </w:rPr>
-        <w:t xml:space="preserve"> DH chacune, attribuées </w:t>
-      </w:r>
-      <w:r>
-        <w:rPr>
-          <w:rFonts w:asciiTheme="majorBidi" w:hAnsiTheme="majorBidi" w:cstheme="majorBidi"/>
-          <w:bCs/>
-          <w:sz w:val="18"/>
-          <w:szCs w:val="18"/>
-        </w:rPr>
-        <w:t>à</w:t>
-      </w:r>
-      <w:r>
-        <w:rPr>
-          <w:rFonts w:asciiTheme="majorBidi" w:hAnsiTheme="majorBidi" w:cstheme="majorBidi"/>
+          <w:rFonts w:asciiTheme="minorHAnsi" w:hAnsiTheme="minorHAnsi" w:cstheme="minorHAnsi"/>
+          <w:bCs/>
+          <w:sz w:val="18"/>
+          <w:szCs w:val="18"/>
+        </w:rPr>
+        <w:t>l’</w:t>
+      </w:r>
+      <w:r>
+        <w:rPr>
+          <w:rFonts w:asciiTheme="minorHAnsi" w:hAnsiTheme="minorHAnsi" w:cstheme="minorHAnsi"/>
+          <w:bCs/>
+          <w:sz w:val="18"/>
+          <w:szCs w:val="18"/>
+        </w:rPr>
+        <w:t>associé</w:t>
+      </w:r>
+      <w:r>
+        <w:rPr>
+          <w:rFonts w:asciiTheme="minorHAnsi" w:hAnsiTheme="minorHAnsi" w:cstheme="minorHAnsi"/>
+          <w:bCs/>
+          <w:sz w:val="18"/>
+          <w:szCs w:val="18"/>
+        </w:rPr>
+        <w:t xml:space="preserve"> unique :</w:t>
+      </w:r>
+      <w:r>
+        <w:rPr>
+          <w:rFonts w:asciiTheme="minorHAnsi" w:hAnsiTheme="minorHAnsi" w:cstheme="minorHAnsi"/>
           <w:bCs/>
           <w:sz w:val="18"/>
           <w:szCs w:val="18"/>
@@ -702,43 +925,7 @@
       </w:r>
       <w:r>
         <w:rPr>
-          <w:rFonts w:asciiTheme="majorBidi" w:hAnsiTheme="majorBidi" w:cstheme="majorBidi"/>
-          <w:bCs/>
-          <w:sz w:val="18"/>
-          <w:szCs w:val="18"/>
-        </w:rPr>
-        <w:t>l’</w:t>
-      </w:r>
-      <w:r>
-        <w:rPr>
-          <w:rFonts w:asciiTheme="majorBidi" w:hAnsiTheme="majorBidi" w:cstheme="majorBidi"/>
-          <w:bCs/>
-          <w:sz w:val="18"/>
-          <w:szCs w:val="18"/>
-        </w:rPr>
-        <w:t>associé</w:t>
-      </w:r>
-      <w:r>
-        <w:rPr>
-          <w:rFonts w:asciiTheme="majorBidi" w:hAnsiTheme="majorBidi" w:cstheme="majorBidi"/>
-          <w:bCs/>
-          <w:sz w:val="18"/>
-          <w:szCs w:val="18"/>
-        </w:rPr>
-        <w:t xml:space="preserve"> unique :</w:t>
-      </w:r>
-      <w:r>
-        <w:rPr>
-          <w:rFonts w:asciiTheme="majorBidi" w:hAnsiTheme="majorBidi" w:cstheme="majorBidi"/>
-          <w:bCs/>
-          <w:sz w:val="18"/>
-          <w:szCs w:val="18"/>
-        </w:rPr>
-        <w:t xml:space="preserve"> </w:t>
-      </w:r>
-      <w:r>
-        <w:rPr>
-          <w:rFonts w:asciiTheme="majorBidi" w:hAnsiTheme="majorBidi" w:cstheme="majorBidi"/>
+          <w:rFonts w:asciiTheme="minorHAnsi" w:hAnsiTheme="minorHAnsi" w:cstheme="minorHAnsi"/>
           <w:sz w:val="18"/>
           <w:szCs w:val="18"/>
           <w:lang w:val="fr-CA"/>
@@ -747,7 +934,7 @@
       </w:r>
       <w:r>
         <w:rPr>
-          <w:rFonts w:asciiTheme="majorBidi" w:hAnsiTheme="majorBidi" w:cstheme="majorBidi"/>
+          <w:rFonts w:asciiTheme="minorHAnsi" w:hAnsiTheme="minorHAnsi" w:cstheme="minorHAnsi"/>
           <w:sz w:val="18"/>
           <w:szCs w:val="18"/>
           <w:lang w:val="fr-CA"/>
@@ -760,24 +947,135 @@
         <w:ind w:left="207" w:firstLine="360"/>
         <w:jc w:val="both"/>
         <w:rPr>
-          <w:rFonts w:asciiTheme="majorBidi" w:hAnsiTheme="majorBidi" w:cstheme="majorBidi"/>
-          <w:b/>
-          <w:sz w:val="18"/>
-          <w:szCs w:val="18"/>
-        </w:rPr>
-      </w:pPr>
-      <w:r>
-        <w:rPr>
-          <w:rFonts w:asciiTheme="majorBidi" w:hAnsiTheme="majorBidi" w:cstheme="majorBidi"/>
-          <w:b/>
-          <w:sz w:val="18"/>
-          <w:szCs w:val="18"/>
-        </w:rPr>
-        <w:t>{{ CIVILITE_ASSOCIE }}</w:t>
-      </w:r>
-      <w:r>
-        <w:rPr>
-          <w:rFonts w:asciiTheme="majorBidi" w:hAnsiTheme="majorBidi" w:cstheme="majorBidi"/>
+          <w:rFonts w:asciiTheme="minorHAnsi" w:hAnsiTheme="minorHAnsi" w:cstheme="minorHAnsi"/>
+          <w:b/>
+          <w:sz w:val="18"/>
+          <w:szCs w:val="18"/>
+        </w:rPr>
+      </w:pPr>
+      <w:proofErr w:type="gramStart"/>
+      <w:r>
+        <w:rPr>
+          <w:rFonts w:asciiTheme="minorHAnsi" w:hAnsiTheme="minorHAnsi" w:cstheme="minorHAnsi"/>
+          <w:b/>
+          <w:sz w:val="18"/>
+          <w:szCs w:val="18"/>
+        </w:rPr>
+        <w:t>{{ CIVILITE</w:t>
+      </w:r>
+      <w:proofErr w:type="gramEnd"/>
+      <w:r>
+        <w:rPr>
+          <w:rFonts w:asciiTheme="minorHAnsi" w:hAnsiTheme="minorHAnsi" w:cstheme="minorHAnsi"/>
+          <w:b/>
+          <w:sz w:val="18"/>
+          <w:szCs w:val="18"/>
+        </w:rPr>
+        <w:t>_</w:t>
+      </w:r>
+      <w:proofErr w:type="gramStart"/>
+      <w:r>
+        <w:rPr>
+          <w:rFonts w:asciiTheme="minorHAnsi" w:hAnsiTheme="minorHAnsi" w:cstheme="minorHAnsi"/>
+          <w:b/>
+          <w:sz w:val="18"/>
+          <w:szCs w:val="18"/>
+        </w:rPr>
+        <w:t>ASSOCIE }</w:t>
+      </w:r>
+      <w:proofErr w:type="gramEnd"/>
+      <w:r>
+        <w:rPr>
+          <w:rFonts w:asciiTheme="minorHAnsi" w:hAnsiTheme="minorHAnsi" w:cstheme="minorHAnsi"/>
+          <w:b/>
+          <w:sz w:val="18"/>
+          <w:szCs w:val="18"/>
+        </w:rPr>
+        <w:t xml:space="preserve">} </w:t>
+      </w:r>
+      <w:proofErr w:type="gramStart"/>
+      <w:r>
+        <w:rPr>
+          <w:rFonts w:asciiTheme="minorHAnsi" w:hAnsiTheme="minorHAnsi" w:cstheme="minorHAnsi"/>
+          <w:b/>
+          <w:sz w:val="18"/>
+          <w:szCs w:val="18"/>
+        </w:rPr>
+        <w:t>{{ PRENOM</w:t>
+      </w:r>
+      <w:proofErr w:type="gramEnd"/>
+      <w:r>
+        <w:rPr>
+          <w:rFonts w:asciiTheme="minorHAnsi" w:hAnsiTheme="minorHAnsi" w:cstheme="minorHAnsi"/>
+          <w:b/>
+          <w:sz w:val="18"/>
+          <w:szCs w:val="18"/>
+        </w:rPr>
+        <w:t>_</w:t>
+      </w:r>
+      <w:proofErr w:type="gramStart"/>
+      <w:r>
+        <w:rPr>
+          <w:rFonts w:asciiTheme="minorHAnsi" w:hAnsiTheme="minorHAnsi" w:cstheme="minorHAnsi"/>
+          <w:b/>
+          <w:sz w:val="18"/>
+          <w:szCs w:val="18"/>
+        </w:rPr>
+        <w:t>ASSOCIE }</w:t>
+      </w:r>
+      <w:proofErr w:type="gramEnd"/>
+      <w:r>
+        <w:rPr>
+          <w:rFonts w:asciiTheme="minorHAnsi" w:hAnsiTheme="minorHAnsi" w:cstheme="minorHAnsi"/>
+          <w:b/>
+          <w:sz w:val="18"/>
+          <w:szCs w:val="18"/>
+        </w:rPr>
+        <w:t xml:space="preserve">} </w:t>
+      </w:r>
+      <w:proofErr w:type="gramStart"/>
+      <w:r>
+        <w:rPr>
+          <w:rFonts w:asciiTheme="minorHAnsi" w:hAnsiTheme="minorHAnsi" w:cstheme="minorHAnsi"/>
+          <w:b/>
+          <w:sz w:val="18"/>
+          <w:szCs w:val="18"/>
+        </w:rPr>
+        <w:t>{{ NOM</w:t>
+      </w:r>
+      <w:proofErr w:type="gramEnd"/>
+      <w:r>
+        <w:rPr>
+          <w:rFonts w:asciiTheme="minorHAnsi" w:hAnsiTheme="minorHAnsi" w:cstheme="minorHAnsi"/>
+          <w:b/>
+          <w:sz w:val="18"/>
+          <w:szCs w:val="18"/>
+        </w:rPr>
+        <w:t>_</w:t>
+      </w:r>
+      <w:proofErr w:type="gramStart"/>
+      <w:r>
+        <w:rPr>
+          <w:rFonts w:asciiTheme="minorHAnsi" w:hAnsiTheme="minorHAnsi" w:cstheme="minorHAnsi"/>
+          <w:b/>
+          <w:sz w:val="18"/>
+          <w:szCs w:val="18"/>
+        </w:rPr>
+        <w:t>ASSOCIE }</w:t>
+      </w:r>
+      <w:proofErr w:type="gramEnd"/>
+      <w:r>
+        <w:rPr>
+          <w:rFonts w:asciiTheme="minorHAnsi" w:hAnsiTheme="minorHAnsi" w:cstheme="minorHAnsi"/>
+          <w:b/>
+          <w:sz w:val="18"/>
+          <w:szCs w:val="18"/>
+        </w:rPr>
+        <w:t>}</w:t>
+      </w:r>
+      <w:r>
+        <w:rPr>
+          <w:rFonts w:asciiTheme="minorHAnsi" w:hAnsiTheme="minorHAnsi" w:cstheme="minorHAnsi"/>
           <w:b/>
           <w:sz w:val="18"/>
           <w:szCs w:val="18"/>
@@ -786,43 +1084,7 @@
       </w:r>
       <w:r>
         <w:rPr>
-          <w:rFonts w:asciiTheme="majorBidi" w:hAnsiTheme="majorBidi" w:cstheme="majorBidi"/>
-          <w:b/>
-          <w:sz w:val="18"/>
-          <w:szCs w:val="18"/>
-        </w:rPr>
-        <w:t>{{ PRENOM_ASSOCIE }}</w:t>
-      </w:r>
-      <w:r>
-        <w:rPr>
-          <w:rFonts w:asciiTheme="majorBidi" w:hAnsiTheme="majorBidi" w:cstheme="majorBidi"/>
-          <w:b/>
-          <w:sz w:val="18"/>
-          <w:szCs w:val="18"/>
-        </w:rPr>
-        <w:t xml:space="preserve"> </w:t>
-      </w:r>
-      <w:r>
-        <w:rPr>
-          <w:rFonts w:asciiTheme="majorBidi" w:hAnsiTheme="majorBidi" w:cstheme="majorBidi"/>
-          <w:b/>
-          <w:sz w:val="18"/>
-          <w:szCs w:val="18"/>
-        </w:rPr>
-        <w:t>{{ NOM_ASSOCIE }}</w:t>
-      </w:r>
-      <w:r>
-        <w:rPr>
-          <w:rFonts w:asciiTheme="majorBidi" w:hAnsiTheme="majorBidi" w:cstheme="majorBidi"/>
-          <w:b/>
-          <w:sz w:val="18"/>
-          <w:szCs w:val="18"/>
-        </w:rPr>
-        <w:t xml:space="preserve"> </w:t>
-      </w:r>
-      <w:r>
-        <w:rPr>
-          <w:rFonts w:asciiTheme="majorBidi" w:hAnsiTheme="majorBidi" w:cstheme="majorBidi"/>
+          <w:rFonts w:asciiTheme="minorHAnsi" w:hAnsiTheme="minorHAnsi" w:cstheme="minorHAnsi"/>
           <w:b/>
           <w:sz w:val="18"/>
           <w:szCs w:val="18"/>
@@ -831,7 +1093,7 @@
       </w:r>
       <w:r>
         <w:rPr>
-          <w:rFonts w:asciiTheme="majorBidi" w:hAnsiTheme="majorBidi" w:cstheme="majorBidi"/>
+          <w:rFonts w:asciiTheme="minorHAnsi" w:hAnsiTheme="minorHAnsi" w:cstheme="minorHAnsi"/>
           <w:b/>
           <w:sz w:val="18"/>
           <w:szCs w:val="18"/>
@@ -840,7 +1102,7 @@
       </w:r>
       <w:r>
         <w:rPr>
-          <w:rFonts w:asciiTheme="majorBidi" w:hAnsiTheme="majorBidi" w:cstheme="majorBidi"/>
+          <w:rFonts w:asciiTheme="minorHAnsi" w:hAnsiTheme="minorHAnsi" w:cstheme="minorHAnsi"/>
           <w:b/>
           <w:sz w:val="18"/>
           <w:szCs w:val="18"/>
@@ -849,7 +1111,7 @@
       </w:r>
       <w:r>
         <w:rPr>
-          <w:rFonts w:asciiTheme="majorBidi" w:hAnsiTheme="majorBidi" w:cstheme="majorBidi"/>
+          <w:rFonts w:asciiTheme="minorHAnsi" w:hAnsiTheme="minorHAnsi" w:cstheme="minorHAnsi"/>
           <w:b/>
           <w:sz w:val="18"/>
           <w:szCs w:val="18"/>
@@ -858,34 +1120,56 @@
       </w:r>
       <w:r>
         <w:rPr>
-          <w:rFonts w:asciiTheme="majorBidi" w:hAnsiTheme="majorBidi" w:cstheme="majorBidi"/>
+          <w:rFonts w:asciiTheme="minorHAnsi" w:hAnsiTheme="minorHAnsi" w:cstheme="minorHAnsi"/>
           <w:b/>
           <w:sz w:val="18"/>
           <w:szCs w:val="18"/>
         </w:rPr>
         <w:t>------</w:t>
       </w:r>
-      <w:r>
-        <w:rPr>
-          <w:rFonts w:asciiTheme="majorBidi" w:hAnsiTheme="majorBidi" w:cstheme="majorBidi"/>
-          <w:b/>
-          <w:sz w:val="18"/>
-          <w:szCs w:val="18"/>
-        </w:rPr>
-        <w:t>{{ NOMBRE_PARTS_SOCIALES }}</w:t>
-      </w:r>
-      <w:r>
-        <w:rPr>
-          <w:rFonts w:asciiTheme="majorBidi" w:hAnsiTheme="majorBidi" w:cstheme="majorBidi"/>
-          <w:b/>
-          <w:sz w:val="18"/>
-          <w:szCs w:val="18"/>
-        </w:rPr>
-        <w:t xml:space="preserve"> </w:t>
-      </w:r>
-      <w:r>
-        <w:rPr>
-          <w:rFonts w:asciiTheme="majorBidi" w:hAnsiTheme="majorBidi" w:cstheme="majorBidi"/>
+      <w:proofErr w:type="gramStart"/>
+      <w:r>
+        <w:rPr>
+          <w:rFonts w:asciiTheme="minorHAnsi" w:hAnsiTheme="minorHAnsi" w:cstheme="minorHAnsi"/>
+          <w:b/>
+          <w:sz w:val="18"/>
+          <w:szCs w:val="18"/>
+        </w:rPr>
+        <w:t>{{ NOMBRE</w:t>
+      </w:r>
+      <w:proofErr w:type="gramEnd"/>
+      <w:r>
+        <w:rPr>
+          <w:rFonts w:asciiTheme="minorHAnsi" w:hAnsiTheme="minorHAnsi" w:cstheme="minorHAnsi"/>
+          <w:b/>
+          <w:sz w:val="18"/>
+          <w:szCs w:val="18"/>
+        </w:rPr>
+        <w:t>_PARTS_</w:t>
+      </w:r>
+      <w:proofErr w:type="gramStart"/>
+      <w:r>
+        <w:rPr>
+          <w:rFonts w:asciiTheme="minorHAnsi" w:hAnsiTheme="minorHAnsi" w:cstheme="minorHAnsi"/>
+          <w:b/>
+          <w:sz w:val="18"/>
+          <w:szCs w:val="18"/>
+        </w:rPr>
+        <w:t>SOCIALES }</w:t>
+      </w:r>
+      <w:proofErr w:type="gramEnd"/>
+      <w:r>
+        <w:rPr>
+          <w:rFonts w:asciiTheme="minorHAnsi" w:hAnsiTheme="minorHAnsi" w:cstheme="minorHAnsi"/>
+          <w:b/>
+          <w:sz w:val="18"/>
+          <w:szCs w:val="18"/>
+        </w:rPr>
+        <w:t xml:space="preserve">} </w:t>
+      </w:r>
+      <w:r>
+        <w:rPr>
+          <w:rFonts w:asciiTheme="minorHAnsi" w:hAnsiTheme="minorHAnsi" w:cstheme="minorHAnsi"/>
           <w:b/>
           <w:sz w:val="18"/>
           <w:szCs w:val="18"/>
@@ -899,15 +1183,15 @@
         <w:ind w:left="567"/>
         <w:jc w:val="both"/>
         <w:rPr>
-          <w:rFonts w:asciiTheme="majorBidi" w:hAnsiTheme="majorBidi" w:cstheme="majorBidi"/>
-          <w:b/>
-          <w:sz w:val="18"/>
-          <w:szCs w:val="18"/>
-        </w:rPr>
-      </w:pPr>
-      <w:r>
-        <w:rPr>
-          <w:rFonts w:asciiTheme="majorBidi" w:hAnsiTheme="majorBidi" w:cstheme="majorBidi"/>
+          <w:rFonts w:asciiTheme="minorHAnsi" w:hAnsiTheme="minorHAnsi" w:cstheme="minorHAnsi"/>
+          <w:b/>
+          <w:sz w:val="18"/>
+          <w:szCs w:val="18"/>
+        </w:rPr>
+      </w:pPr>
+      <w:r>
+        <w:rPr>
+          <w:rFonts w:asciiTheme="minorHAnsi" w:hAnsiTheme="minorHAnsi" w:cstheme="minorHAnsi"/>
           <w:b/>
           <w:sz w:val="18"/>
           <w:szCs w:val="18"/>
@@ -916,7 +1200,7 @@
       </w:r>
       <w:r>
         <w:rPr>
-          <w:rFonts w:asciiTheme="majorBidi" w:hAnsiTheme="majorBidi" w:cstheme="majorBidi"/>
+          <w:rFonts w:asciiTheme="minorHAnsi" w:hAnsiTheme="minorHAnsi" w:cstheme="minorHAnsi"/>
           <w:b/>
           <w:sz w:val="18"/>
           <w:szCs w:val="18"/>
@@ -925,7 +1209,7 @@
       </w:r>
       <w:r>
         <w:rPr>
-          <w:rFonts w:asciiTheme="majorBidi" w:hAnsiTheme="majorBidi" w:cstheme="majorBidi"/>
+          <w:rFonts w:asciiTheme="minorHAnsi" w:hAnsiTheme="minorHAnsi" w:cstheme="minorHAnsi"/>
           <w:b/>
           <w:sz w:val="18"/>
           <w:szCs w:val="18"/>
@@ -934,7 +1218,7 @@
       </w:r>
       <w:r>
         <w:rPr>
-          <w:rFonts w:asciiTheme="majorBidi" w:hAnsiTheme="majorBidi" w:cstheme="majorBidi"/>
+          <w:rFonts w:asciiTheme="minorHAnsi" w:hAnsiTheme="minorHAnsi" w:cstheme="minorHAnsi"/>
           <w:b/>
           <w:sz w:val="18"/>
           <w:szCs w:val="18"/>
@@ -943,7 +1227,7 @@
       </w:r>
       <w:r>
         <w:rPr>
-          <w:rFonts w:asciiTheme="majorBidi" w:hAnsiTheme="majorBidi" w:cstheme="majorBidi"/>
+          <w:rFonts w:asciiTheme="minorHAnsi" w:hAnsiTheme="minorHAnsi" w:cstheme="minorHAnsi"/>
           <w:b/>
           <w:sz w:val="18"/>
           <w:szCs w:val="18"/>
@@ -952,7 +1236,7 @@
       </w:r>
       <w:r>
         <w:rPr>
-          <w:rFonts w:asciiTheme="majorBidi" w:hAnsiTheme="majorBidi" w:cstheme="majorBidi"/>
+          <w:rFonts w:asciiTheme="minorHAnsi" w:hAnsiTheme="minorHAnsi" w:cstheme="minorHAnsi"/>
           <w:b/>
           <w:sz w:val="18"/>
           <w:szCs w:val="18"/>
@@ -961,34 +1245,56 @@
       </w:r>
       <w:r>
         <w:rPr>
-          <w:rFonts w:asciiTheme="majorBidi" w:hAnsiTheme="majorBidi" w:cstheme="majorBidi"/>
+          <w:rFonts w:asciiTheme="minorHAnsi" w:hAnsiTheme="minorHAnsi" w:cstheme="minorHAnsi"/>
           <w:b/>
           <w:sz w:val="18"/>
           <w:szCs w:val="18"/>
         </w:rPr>
         <w:t>-</w:t>
       </w:r>
-      <w:r>
-        <w:rPr>
-          <w:rFonts w:asciiTheme="majorBidi" w:hAnsiTheme="majorBidi" w:cstheme="majorBidi"/>
-          <w:b/>
-          <w:sz w:val="18"/>
-          <w:szCs w:val="18"/>
-        </w:rPr>
-        <w:t>{{ NOMBRE_PARTS_SOCIALES }}</w:t>
-      </w:r>
-      <w:r>
-        <w:rPr>
-          <w:rFonts w:asciiTheme="majorBidi" w:hAnsiTheme="majorBidi" w:cstheme="majorBidi"/>
-          <w:b/>
-          <w:sz w:val="18"/>
-          <w:szCs w:val="18"/>
-        </w:rPr>
-        <w:t xml:space="preserve"> </w:t>
-      </w:r>
-      <w:r>
-        <w:rPr>
-          <w:rFonts w:asciiTheme="majorBidi" w:hAnsiTheme="majorBidi" w:cstheme="majorBidi"/>
+      <w:proofErr w:type="gramStart"/>
+      <w:r>
+        <w:rPr>
+          <w:rFonts w:asciiTheme="minorHAnsi" w:hAnsiTheme="minorHAnsi" w:cstheme="minorHAnsi"/>
+          <w:b/>
+          <w:sz w:val="18"/>
+          <w:szCs w:val="18"/>
+        </w:rPr>
+        <w:t>{{ NOMBRE</w:t>
+      </w:r>
+      <w:proofErr w:type="gramEnd"/>
+      <w:r>
+        <w:rPr>
+          <w:rFonts w:asciiTheme="minorHAnsi" w:hAnsiTheme="minorHAnsi" w:cstheme="minorHAnsi"/>
+          <w:b/>
+          <w:sz w:val="18"/>
+          <w:szCs w:val="18"/>
+        </w:rPr>
+        <w:t>_PARTS_</w:t>
+      </w:r>
+      <w:proofErr w:type="gramStart"/>
+      <w:r>
+        <w:rPr>
+          <w:rFonts w:asciiTheme="minorHAnsi" w:hAnsiTheme="minorHAnsi" w:cstheme="minorHAnsi"/>
+          <w:b/>
+          <w:sz w:val="18"/>
+          <w:szCs w:val="18"/>
+        </w:rPr>
+        <w:t>SOCIALES }</w:t>
+      </w:r>
+      <w:proofErr w:type="gramEnd"/>
+      <w:r>
+        <w:rPr>
+          <w:rFonts w:asciiTheme="minorHAnsi" w:hAnsiTheme="minorHAnsi" w:cstheme="minorHAnsi"/>
+          <w:b/>
+          <w:sz w:val="18"/>
+          <w:szCs w:val="18"/>
+        </w:rPr>
+        <w:t xml:space="preserve">} </w:t>
+      </w:r>
+      <w:r>
+        <w:rPr>
+          <w:rFonts w:asciiTheme="minorHAnsi" w:hAnsiTheme="minorHAnsi" w:cstheme="minorHAnsi"/>
           <w:b/>
           <w:sz w:val="18"/>
           <w:szCs w:val="18"/>
@@ -1006,15 +1312,15 @@
         <w:ind w:left="567"/>
         <w:jc w:val="both"/>
         <w:rPr>
-          <w:rFonts w:asciiTheme="majorBidi" w:hAnsiTheme="majorBidi" w:cstheme="majorBidi"/>
-          <w:bCs/>
-          <w:sz w:val="18"/>
-          <w:szCs w:val="18"/>
-        </w:rPr>
-      </w:pPr>
-      <w:r>
-        <w:rPr>
-          <w:rFonts w:asciiTheme="majorBidi" w:hAnsiTheme="majorBidi" w:cstheme="majorBidi"/>
+          <w:rFonts w:asciiTheme="minorHAnsi" w:hAnsiTheme="minorHAnsi" w:cstheme="minorHAnsi"/>
+          <w:bCs/>
+          <w:sz w:val="18"/>
+          <w:szCs w:val="18"/>
+        </w:rPr>
+      </w:pPr>
+      <w:r>
+        <w:rPr>
+          <w:rFonts w:asciiTheme="minorHAnsi" w:hAnsiTheme="minorHAnsi" w:cstheme="minorHAnsi"/>
           <w:b/>
           <w:sz w:val="18"/>
           <w:szCs w:val="18"/>
@@ -1023,7 +1329,7 @@
       </w:r>
       <w:r>
         <w:rPr>
-          <w:rFonts w:asciiTheme="majorBidi" w:hAnsiTheme="majorBidi" w:cstheme="majorBidi"/>
+          <w:rFonts w:asciiTheme="minorHAnsi" w:hAnsiTheme="minorHAnsi" w:cstheme="minorHAnsi"/>
           <w:b/>
           <w:sz w:val="18"/>
           <w:szCs w:val="18"/>
@@ -1032,7 +1338,7 @@
       </w:r>
       <w:r>
         <w:rPr>
-          <w:rFonts w:asciiTheme="majorBidi" w:hAnsiTheme="majorBidi" w:cstheme="majorBidi"/>
+          <w:rFonts w:asciiTheme="minorHAnsi" w:hAnsiTheme="minorHAnsi" w:cstheme="minorHAnsi"/>
           <w:b/>
           <w:sz w:val="18"/>
           <w:szCs w:val="18"/>
@@ -1041,7 +1347,7 @@
       </w:r>
       <w:r>
         <w:rPr>
-          <w:rFonts w:asciiTheme="majorBidi" w:hAnsiTheme="majorBidi" w:cstheme="majorBidi"/>
+          <w:rFonts w:asciiTheme="minorHAnsi" w:hAnsiTheme="minorHAnsi" w:cstheme="minorHAnsi"/>
           <w:b/>
           <w:sz w:val="18"/>
           <w:szCs w:val="18"/>
@@ -1050,7 +1356,7 @@
       </w:r>
       <w:r>
         <w:rPr>
-          <w:rFonts w:asciiTheme="majorBidi" w:hAnsiTheme="majorBidi" w:cstheme="majorBidi"/>
+          <w:rFonts w:asciiTheme="minorHAnsi" w:hAnsiTheme="minorHAnsi" w:cstheme="minorHAnsi"/>
           <w:bCs/>
           <w:sz w:val="18"/>
           <w:szCs w:val="18"/>
@@ -1059,39 +1365,141 @@
       </w:r>
       <w:r>
         <w:rPr>
-          <w:rFonts w:asciiTheme="majorBidi" w:hAnsiTheme="majorBidi" w:cstheme="majorBidi"/>
+          <w:rFonts w:asciiTheme="minorHAnsi" w:hAnsiTheme="minorHAnsi" w:cstheme="minorHAnsi"/>
           <w:bCs/>
           <w:sz w:val="18"/>
           <w:szCs w:val="18"/>
         </w:rPr>
         <w:t xml:space="preserve"> </w:t>
       </w:r>
-      <w:r>
-        <w:rPr>
-          <w:rFonts w:asciiTheme="majorBidi" w:hAnsiTheme="majorBidi" w:cstheme="majorBidi"/>
-          <w:b/>
-          <w:sz w:val="18"/>
-          <w:szCs w:val="18"/>
-        </w:rPr>
-        <w:t>{{ CIVILITE_ASSOCIE }} {{ PRENOM_ASSOCIE }} {{ NOM_ASSOCIE }}</w:t>
-      </w:r>
-      <w:r>
-        <w:rPr>
-          <w:rFonts w:asciiTheme="majorBidi" w:hAnsiTheme="majorBidi" w:cstheme="majorBidi"/>
-          <w:b/>
-          <w:sz w:val="18"/>
-          <w:szCs w:val="18"/>
-        </w:rPr>
-        <w:t>.</w:t>
-      </w:r>
-      <w:r>
-        <w:rPr>
-          <w:rFonts w:asciiTheme="majorBidi" w:hAnsiTheme="majorBidi" w:cstheme="majorBidi"/>
-          <w:b/>
-          <w:sz w:val="18"/>
-          <w:szCs w:val="18"/>
-        </w:rPr>
-        <w:t xml:space="preserve"> </w:t>
+      <w:proofErr w:type="gramStart"/>
+      <w:r>
+        <w:rPr>
+          <w:rFonts w:asciiTheme="minorHAnsi" w:hAnsiTheme="minorHAnsi" w:cstheme="minorHAnsi"/>
+          <w:b/>
+          <w:sz w:val="18"/>
+          <w:szCs w:val="18"/>
+        </w:rPr>
+        <w:t>{{ CIVILITE</w:t>
+      </w:r>
+      <w:proofErr w:type="gramEnd"/>
+      <w:r>
+        <w:rPr>
+          <w:rFonts w:asciiTheme="minorHAnsi" w:hAnsiTheme="minorHAnsi" w:cstheme="minorHAnsi"/>
+          <w:b/>
+          <w:sz w:val="18"/>
+          <w:szCs w:val="18"/>
+        </w:rPr>
+        <w:t>_</w:t>
+      </w:r>
+      <w:proofErr w:type="gramStart"/>
+      <w:r>
+        <w:rPr>
+          <w:rFonts w:asciiTheme="minorHAnsi" w:hAnsiTheme="minorHAnsi" w:cstheme="minorHAnsi"/>
+          <w:b/>
+          <w:sz w:val="18"/>
+          <w:szCs w:val="18"/>
+        </w:rPr>
+        <w:t>ASSOCIE }</w:t>
+      </w:r>
+      <w:proofErr w:type="gramEnd"/>
+      <w:r>
+        <w:rPr>
+          <w:rFonts w:asciiTheme="minorHAnsi" w:hAnsiTheme="minorHAnsi" w:cstheme="minorHAnsi"/>
+          <w:b/>
+          <w:sz w:val="18"/>
+          <w:szCs w:val="18"/>
+        </w:rPr>
+        <w:t xml:space="preserve">} </w:t>
+      </w:r>
+      <w:proofErr w:type="gramStart"/>
+      <w:r>
+        <w:rPr>
+          <w:rFonts w:asciiTheme="minorHAnsi" w:hAnsiTheme="minorHAnsi" w:cstheme="minorHAnsi"/>
+          <w:b/>
+          <w:sz w:val="18"/>
+          <w:szCs w:val="18"/>
+        </w:rPr>
+        <w:t>{{ PRENOM</w:t>
+      </w:r>
+      <w:proofErr w:type="gramEnd"/>
+      <w:r>
+        <w:rPr>
+          <w:rFonts w:asciiTheme="minorHAnsi" w:hAnsiTheme="minorHAnsi" w:cstheme="minorHAnsi"/>
+          <w:b/>
+          <w:sz w:val="18"/>
+          <w:szCs w:val="18"/>
+        </w:rPr>
+        <w:t>_</w:t>
+      </w:r>
+      <w:proofErr w:type="gramStart"/>
+      <w:r>
+        <w:rPr>
+          <w:rFonts w:asciiTheme="minorHAnsi" w:hAnsiTheme="minorHAnsi" w:cstheme="minorHAnsi"/>
+          <w:b/>
+          <w:sz w:val="18"/>
+          <w:szCs w:val="18"/>
+        </w:rPr>
+        <w:t>ASSOCIE }</w:t>
+      </w:r>
+      <w:proofErr w:type="gramEnd"/>
+      <w:r>
+        <w:rPr>
+          <w:rFonts w:asciiTheme="minorHAnsi" w:hAnsiTheme="minorHAnsi" w:cstheme="minorHAnsi"/>
+          <w:b/>
+          <w:sz w:val="18"/>
+          <w:szCs w:val="18"/>
+        </w:rPr>
+        <w:t xml:space="preserve">} </w:t>
+      </w:r>
+      <w:proofErr w:type="gramStart"/>
+      <w:r>
+        <w:rPr>
+          <w:rFonts w:asciiTheme="minorHAnsi" w:hAnsiTheme="minorHAnsi" w:cstheme="minorHAnsi"/>
+          <w:b/>
+          <w:sz w:val="18"/>
+          <w:szCs w:val="18"/>
+        </w:rPr>
+        <w:t>{{ NOM</w:t>
+      </w:r>
+      <w:proofErr w:type="gramEnd"/>
+      <w:r>
+        <w:rPr>
+          <w:rFonts w:asciiTheme="minorHAnsi" w:hAnsiTheme="minorHAnsi" w:cstheme="minorHAnsi"/>
+          <w:b/>
+          <w:sz w:val="18"/>
+          <w:szCs w:val="18"/>
+        </w:rPr>
+        <w:t>_</w:t>
+      </w:r>
+      <w:proofErr w:type="gramStart"/>
+      <w:r>
+        <w:rPr>
+          <w:rFonts w:asciiTheme="minorHAnsi" w:hAnsiTheme="minorHAnsi" w:cstheme="minorHAnsi"/>
+          <w:b/>
+          <w:sz w:val="18"/>
+          <w:szCs w:val="18"/>
+        </w:rPr>
+        <w:t>ASSOCIE }</w:t>
+      </w:r>
+      <w:proofErr w:type="gramEnd"/>
+      <w:r>
+        <w:rPr>
+          <w:rFonts w:asciiTheme="minorHAnsi" w:hAnsiTheme="minorHAnsi" w:cstheme="minorHAnsi"/>
+          <w:b/>
+          <w:sz w:val="18"/>
+          <w:szCs w:val="18"/>
+        </w:rPr>
+        <w:t>}</w:t>
+      </w:r>
+      <w:r>
+        <w:rPr>
+          <w:rFonts w:asciiTheme="minorHAnsi" w:hAnsiTheme="minorHAnsi" w:cstheme="minorHAnsi"/>
+          <w:b/>
+          <w:sz w:val="18"/>
+          <w:szCs w:val="18"/>
+        </w:rPr>
+        <w:t xml:space="preserve">. </w:t>
       </w:r>
     </w:p>
     <w:p>
@@ -1104,15 +1512,15 @@
         <w:ind w:left="567"/>
         <w:jc w:val="both"/>
         <w:rPr>
-          <w:rFonts w:asciiTheme="majorBidi" w:hAnsiTheme="majorBidi" w:cstheme="majorBidi"/>
-          <w:bCs/>
-          <w:sz w:val="18"/>
-          <w:szCs w:val="18"/>
-        </w:rPr>
-      </w:pPr>
-      <w:r>
-        <w:rPr>
-          <w:rFonts w:asciiTheme="majorBidi" w:hAnsiTheme="majorBidi" w:cstheme="majorBidi"/>
+          <w:rFonts w:asciiTheme="minorHAnsi" w:hAnsiTheme="minorHAnsi" w:cstheme="minorHAnsi"/>
+          <w:bCs/>
+          <w:sz w:val="18"/>
+          <w:szCs w:val="18"/>
+        </w:rPr>
+      </w:pPr>
+      <w:r>
+        <w:rPr>
+          <w:rFonts w:asciiTheme="minorHAnsi" w:hAnsiTheme="minorHAnsi" w:cstheme="minorHAnsi"/>
           <w:b/>
           <w:sz w:val="18"/>
           <w:szCs w:val="18"/>
@@ -1121,7 +1529,7 @@
       </w:r>
       <w:r>
         <w:rPr>
-          <w:rFonts w:asciiTheme="majorBidi" w:hAnsiTheme="majorBidi" w:cstheme="majorBidi"/>
+          <w:rFonts w:asciiTheme="minorHAnsi" w:hAnsiTheme="minorHAnsi" w:cstheme="minorHAnsi"/>
           <w:b/>
           <w:sz w:val="18"/>
           <w:szCs w:val="18"/>
@@ -1130,7 +1538,7 @@
       </w:r>
       <w:r>
         <w:rPr>
-          <w:rFonts w:asciiTheme="majorBidi" w:hAnsiTheme="majorBidi" w:cstheme="majorBidi"/>
+          <w:rFonts w:asciiTheme="minorHAnsi" w:hAnsiTheme="minorHAnsi" w:cstheme="minorHAnsi"/>
           <w:b/>
           <w:sz w:val="18"/>
           <w:szCs w:val="18"/>
@@ -1139,7 +1547,7 @@
       </w:r>
       <w:r>
         <w:rPr>
-          <w:rFonts w:asciiTheme="majorBidi" w:hAnsiTheme="majorBidi" w:cstheme="majorBidi"/>
+          <w:rFonts w:asciiTheme="minorHAnsi" w:hAnsiTheme="minorHAnsi" w:cstheme="minorHAnsi"/>
           <w:bCs/>
           <w:sz w:val="18"/>
           <w:szCs w:val="18"/>
@@ -1148,7 +1556,7 @@
       </w:r>
       <w:r>
         <w:rPr>
-          <w:rFonts w:asciiTheme="majorBidi" w:hAnsiTheme="majorBidi" w:cstheme="majorBidi"/>
+          <w:rFonts w:asciiTheme="minorHAnsi" w:hAnsiTheme="minorHAnsi" w:cstheme="minorHAnsi"/>
           <w:bCs/>
           <w:sz w:val="18"/>
           <w:szCs w:val="18"/>
@@ -1157,7 +1565,7 @@
       </w:r>
       <w:r>
         <w:rPr>
-          <w:rFonts w:asciiTheme="majorBidi" w:hAnsiTheme="majorBidi" w:cstheme="majorBidi"/>
+          <w:rFonts w:asciiTheme="minorHAnsi" w:hAnsiTheme="minorHAnsi" w:cstheme="minorHAnsi"/>
           <w:bCs/>
           <w:sz w:val="18"/>
           <w:szCs w:val="18"/>
@@ -1166,7 +1574,7 @@
       </w:r>
       <w:r>
         <w:rPr>
-          <w:rFonts w:asciiTheme="majorBidi" w:hAnsiTheme="majorBidi" w:cstheme="majorBidi"/>
+          <w:rFonts w:asciiTheme="minorHAnsi" w:hAnsiTheme="minorHAnsi" w:cstheme="minorHAnsi"/>
           <w:bCs/>
           <w:sz w:val="18"/>
           <w:szCs w:val="18"/>
@@ -1175,7 +1583,7 @@
       </w:r>
       <w:r>
         <w:rPr>
-          <w:rFonts w:asciiTheme="majorBidi" w:hAnsiTheme="majorBidi" w:cstheme="majorBidi"/>
+          <w:rFonts w:asciiTheme="minorHAnsi" w:hAnsiTheme="minorHAnsi" w:cstheme="minorHAnsi"/>
           <w:bCs/>
           <w:sz w:val="18"/>
           <w:szCs w:val="18"/>
@@ -1189,7 +1597,7 @@
         <w:ind w:left="567"/>
         <w:jc w:val="both"/>
         <w:rPr>
-          <w:rFonts w:asciiTheme="majorBidi" w:hAnsiTheme="majorBidi" w:cstheme="majorBidi"/>
+          <w:rFonts w:asciiTheme="minorHAnsi" w:hAnsiTheme="minorHAnsi" w:cstheme="minorHAnsi"/>
           <w:bCs/>
           <w:sz w:val="18"/>
           <w:szCs w:val="18"/>
@@ -1201,15 +1609,15 @@
     <w:p>
       <w:pPr>
         <w:rPr>
-          <w:rFonts w:asciiTheme="majorBidi" w:hAnsiTheme="majorBidi" w:cstheme="majorBidi"/>
-          <w:b/>
-          <w:sz w:val="18"/>
-          <w:szCs w:val="18"/>
-        </w:rPr>
-      </w:pPr>
-      <w:r>
-        <w:rPr>
-          <w:rFonts w:asciiTheme="majorBidi" w:hAnsiTheme="majorBidi" w:cstheme="majorBidi"/>
+          <w:rFonts w:asciiTheme="minorHAnsi" w:hAnsiTheme="minorHAnsi" w:cstheme="minorHAnsi"/>
+          <w:b/>
+          <w:sz w:val="18"/>
+          <w:szCs w:val="18"/>
+        </w:rPr>
+      </w:pPr>
+      <w:r>
+        <w:rPr>
+          <w:rFonts w:asciiTheme="minorHAnsi" w:hAnsiTheme="minorHAnsi" w:cstheme="minorHAnsi"/>
           <w:b/>
           <w:sz w:val="18"/>
           <w:szCs w:val="18"/>
@@ -1218,7 +1626,7 @@
       </w:r>
       <w:r>
         <w:rPr>
-          <w:rFonts w:asciiTheme="majorBidi" w:hAnsiTheme="majorBidi" w:cstheme="majorBidi"/>
+          <w:rFonts w:asciiTheme="minorHAnsi" w:hAnsiTheme="minorHAnsi" w:cstheme="minorHAnsi"/>
           <w:b/>
           <w:sz w:val="18"/>
           <w:szCs w:val="18"/>
@@ -1227,7 +1635,7 @@
       </w:r>
       <w:r>
         <w:rPr>
-          <w:rFonts w:asciiTheme="majorBidi" w:hAnsiTheme="majorBidi" w:cstheme="majorBidi"/>
+          <w:rFonts w:asciiTheme="minorHAnsi" w:hAnsiTheme="minorHAnsi" w:cstheme="minorHAnsi"/>
           <w:bCs/>
           <w:sz w:val="18"/>
           <w:szCs w:val="18"/>
@@ -1236,7 +1644,7 @@
       </w:r>
       <w:r>
         <w:rPr>
-          <w:rFonts w:asciiTheme="majorBidi" w:hAnsiTheme="majorBidi" w:cstheme="majorBidi"/>
+          <w:rFonts w:asciiTheme="minorHAnsi" w:hAnsiTheme="minorHAnsi" w:cstheme="minorHAnsi"/>
           <w:bCs/>
           <w:sz w:val="18"/>
           <w:szCs w:val="18"/>
@@ -1245,7 +1653,7 @@
       </w:r>
       <w:r>
         <w:rPr>
-          <w:rFonts w:asciiTheme="majorBidi" w:hAnsiTheme="majorBidi" w:cstheme="majorBidi"/>
+          <w:rFonts w:asciiTheme="minorHAnsi" w:hAnsiTheme="minorHAnsi" w:cstheme="minorHAnsi"/>
           <w:bCs/>
           <w:sz w:val="18"/>
           <w:szCs w:val="18"/>
@@ -1254,7 +1662,7 @@
       </w:r>
       <w:r>
         <w:rPr>
-          <w:rFonts w:asciiTheme="majorBidi" w:hAnsiTheme="majorBidi" w:cstheme="majorBidi"/>
+          <w:rFonts w:asciiTheme="minorHAnsi" w:hAnsiTheme="minorHAnsi" w:cstheme="minorHAnsi"/>
           <w:bCs/>
           <w:sz w:val="18"/>
           <w:szCs w:val="18"/>
@@ -1263,7 +1671,7 @@
       </w:r>
       <w:r>
         <w:rPr>
-          <w:rFonts w:asciiTheme="majorBidi" w:hAnsiTheme="majorBidi" w:cstheme="majorBidi"/>
+          <w:rFonts w:asciiTheme="minorHAnsi" w:hAnsiTheme="minorHAnsi" w:cstheme="minorHAnsi"/>
           <w:bCs/>
           <w:sz w:val="18"/>
           <w:szCs w:val="18"/>
@@ -1272,7 +1680,7 @@
       </w:r>
       <w:r>
         <w:rPr>
-          <w:rFonts w:asciiTheme="majorBidi" w:hAnsiTheme="majorBidi" w:cstheme="majorBidi"/>
+          <w:rFonts w:asciiTheme="minorHAnsi" w:hAnsiTheme="minorHAnsi" w:cstheme="minorHAnsi"/>
           <w:bCs/>
           <w:sz w:val="18"/>
           <w:szCs w:val="18"/>
@@ -1281,7 +1689,7 @@
       </w:r>
       <w:r>
         <w:rPr>
-          <w:rFonts w:asciiTheme="majorBidi" w:hAnsiTheme="majorBidi" w:cstheme="majorBidi"/>
+          <w:rFonts w:asciiTheme="minorHAnsi" w:hAnsiTheme="minorHAnsi" w:cstheme="minorHAnsi"/>
           <w:bCs/>
           <w:sz w:val="18"/>
           <w:szCs w:val="18"/>
@@ -1290,7 +1698,7 @@
       </w:r>
       <w:r>
         <w:rPr>
-          <w:rFonts w:asciiTheme="majorBidi" w:hAnsiTheme="majorBidi" w:cstheme="majorBidi"/>
+          <w:rFonts w:asciiTheme="minorHAnsi" w:hAnsiTheme="minorHAnsi" w:cstheme="minorHAnsi"/>
           <w:bCs/>
           <w:sz w:val="18"/>
           <w:szCs w:val="18"/>
@@ -1299,7 +1707,7 @@
       </w:r>
       <w:r>
         <w:rPr>
-          <w:rFonts w:asciiTheme="majorBidi" w:hAnsiTheme="majorBidi" w:cstheme="majorBidi"/>
+          <w:rFonts w:asciiTheme="minorHAnsi" w:hAnsiTheme="minorHAnsi" w:cstheme="minorHAnsi"/>
           <w:b/>
           <w:sz w:val="18"/>
           <w:szCs w:val="18"/>
@@ -1308,25 +1716,56 @@
       </w:r>
       <w:r>
         <w:rPr>
-          <w:rFonts w:asciiTheme="majorBidi" w:hAnsiTheme="majorBidi" w:cstheme="majorBidi"/>
+          <w:rFonts w:asciiTheme="minorHAnsi" w:hAnsiTheme="minorHAnsi" w:cstheme="minorHAnsi"/>
           <w:b/>
           <w:sz w:val="18"/>
           <w:szCs w:val="18"/>
         </w:rPr>
         <w:t xml:space="preserve"> </w:t>
       </w:r>
-      <w:r>
-        <w:rPr>
-          <w:rFonts w:asciiTheme="majorBidi" w:hAnsiTheme="majorBidi" w:cstheme="majorBidi"/>
-          <w:b/>
-          <w:sz w:val="18"/>
-          <w:szCs w:val="18"/>
-        </w:rPr>
-        <w:t>{{ NUM_DEPOT_RC }}</w:t>
-      </w:r>
-      <w:r>
-        <w:rPr>
-          <w:rFonts w:asciiTheme="majorBidi" w:hAnsiTheme="majorBidi" w:cstheme="majorBidi"/>
+      <w:proofErr w:type="gramStart"/>
+      <w:r>
+        <w:rPr>
+          <w:rFonts w:asciiTheme="minorHAnsi" w:hAnsiTheme="minorHAnsi" w:cstheme="minorHAnsi"/>
+          <w:b/>
+          <w:sz w:val="18"/>
+          <w:szCs w:val="18"/>
+        </w:rPr>
+        <w:t>{{ NUM</w:t>
+      </w:r>
+      <w:proofErr w:type="gramEnd"/>
+      <w:r>
+        <w:rPr>
+          <w:rFonts w:asciiTheme="minorHAnsi" w:hAnsiTheme="minorHAnsi" w:cstheme="minorHAnsi"/>
+          <w:b/>
+          <w:sz w:val="18"/>
+          <w:szCs w:val="18"/>
+        </w:rPr>
+        <w:t>_DEPOT_</w:t>
+      </w:r>
+      <w:proofErr w:type="gramStart"/>
+      <w:r>
+        <w:rPr>
+          <w:rFonts w:asciiTheme="minorHAnsi" w:hAnsiTheme="minorHAnsi" w:cstheme="minorHAnsi"/>
+          <w:b/>
+          <w:sz w:val="18"/>
+          <w:szCs w:val="18"/>
+        </w:rPr>
+        <w:t>RC }</w:t>
+      </w:r>
+      <w:proofErr w:type="gramEnd"/>
+      <w:r>
+        <w:rPr>
+          <w:rFonts w:asciiTheme="minorHAnsi" w:hAnsiTheme="minorHAnsi" w:cstheme="minorHAnsi"/>
+          <w:b/>
+          <w:sz w:val="18"/>
+          <w:szCs w:val="18"/>
+        </w:rPr>
+        <w:t>}</w:t>
+      </w:r>
+      <w:r>
+        <w:rPr>
+          <w:rFonts w:asciiTheme="minorHAnsi" w:hAnsiTheme="minorHAnsi" w:cstheme="minorHAnsi"/>
           <w:bCs/>
           <w:sz w:val="18"/>
           <w:szCs w:val="18"/>
@@ -1335,7 +1774,7 @@
       </w:r>
       <w:r>
         <w:rPr>
-          <w:rFonts w:asciiTheme="majorBidi" w:hAnsiTheme="majorBidi" w:cstheme="majorBidi"/>
+          <w:rFonts w:asciiTheme="minorHAnsi" w:hAnsiTheme="minorHAnsi" w:cstheme="minorHAnsi"/>
           <w:bCs/>
           <w:sz w:val="18"/>
           <w:szCs w:val="18"/>
@@ -1344,7 +1783,7 @@
       </w:r>
       <w:r>
         <w:rPr>
-          <w:rFonts w:asciiTheme="majorBidi" w:hAnsiTheme="majorBidi" w:cstheme="majorBidi"/>
+          <w:rFonts w:asciiTheme="minorHAnsi" w:hAnsiTheme="minorHAnsi" w:cstheme="minorHAnsi"/>
           <w:bCs/>
           <w:sz w:val="18"/>
           <w:szCs w:val="18"/>
@@ -1353,7 +1792,7 @@
       </w:r>
       <w:r>
         <w:rPr>
-          <w:rFonts w:asciiTheme="majorBidi" w:hAnsiTheme="majorBidi" w:cstheme="majorBidi"/>
+          <w:rFonts w:asciiTheme="minorHAnsi" w:hAnsiTheme="minorHAnsi" w:cstheme="minorHAnsi"/>
           <w:bCs/>
           <w:sz w:val="18"/>
           <w:szCs w:val="18"/>
@@ -1362,7 +1801,7 @@
       </w:r>
       <w:r>
         <w:rPr>
-          <w:rFonts w:asciiTheme="majorBidi" w:hAnsiTheme="majorBidi" w:cstheme="majorBidi"/>
+          <w:rFonts w:asciiTheme="minorHAnsi" w:hAnsiTheme="minorHAnsi" w:cstheme="minorHAnsi"/>
           <w:bCs/>
           <w:sz w:val="18"/>
           <w:szCs w:val="18"/>
@@ -1371,61 +1810,114 @@
       </w:r>
       <w:r>
         <w:rPr>
-          <w:rFonts w:asciiTheme="majorBidi" w:hAnsiTheme="majorBidi" w:cstheme="majorBidi"/>
+          <w:rFonts w:asciiTheme="minorHAnsi" w:hAnsiTheme="minorHAnsi" w:cstheme="minorHAnsi"/>
           <w:bCs/>
           <w:sz w:val="18"/>
           <w:szCs w:val="18"/>
         </w:rPr>
         <w:t xml:space="preserve">° </w:t>
       </w:r>
-      <w:r>
-        <w:rPr>
-          <w:rFonts w:asciiTheme="majorBidi" w:hAnsiTheme="majorBidi" w:cstheme="majorBidi"/>
-          <w:b/>
-          <w:sz w:val="18"/>
-          <w:szCs w:val="18"/>
-        </w:rPr>
-        <w:t>{{ NUM_RC }}</w:t>
-      </w:r>
-      <w:r>
-        <w:rPr>
-          <w:rFonts w:asciiTheme="majorBidi" w:hAnsiTheme="majorBidi" w:cstheme="majorBidi"/>
+      <w:proofErr w:type="gramStart"/>
+      <w:r>
+        <w:rPr>
+          <w:rFonts w:asciiTheme="minorHAnsi" w:hAnsiTheme="minorHAnsi" w:cstheme="minorHAnsi"/>
+          <w:b/>
+          <w:sz w:val="18"/>
+          <w:szCs w:val="18"/>
+        </w:rPr>
+        <w:t>{{ NUM</w:t>
+      </w:r>
+      <w:proofErr w:type="gramEnd"/>
+      <w:r>
+        <w:rPr>
+          <w:rFonts w:asciiTheme="minorHAnsi" w:hAnsiTheme="minorHAnsi" w:cstheme="minorHAnsi"/>
+          <w:b/>
+          <w:sz w:val="18"/>
+          <w:szCs w:val="18"/>
+        </w:rPr>
+        <w:t>_</w:t>
+      </w:r>
+      <w:proofErr w:type="gramStart"/>
+      <w:r>
+        <w:rPr>
+          <w:rFonts w:asciiTheme="minorHAnsi" w:hAnsiTheme="minorHAnsi" w:cstheme="minorHAnsi"/>
+          <w:b/>
+          <w:sz w:val="18"/>
+          <w:szCs w:val="18"/>
+        </w:rPr>
+        <w:t>RC }</w:t>
+      </w:r>
+      <w:proofErr w:type="gramEnd"/>
+      <w:r>
+        <w:rPr>
+          <w:rFonts w:asciiTheme="minorHAnsi" w:hAnsiTheme="minorHAnsi" w:cstheme="minorHAnsi"/>
+          <w:b/>
+          <w:sz w:val="18"/>
+          <w:szCs w:val="18"/>
+        </w:rPr>
+        <w:t xml:space="preserve">} </w:t>
+      </w:r>
+      <w:r>
+        <w:rPr>
+          <w:rFonts w:asciiTheme="minorHAnsi" w:hAnsiTheme="minorHAnsi" w:cstheme="minorHAnsi"/>
+          <w:bCs/>
+          <w:sz w:val="18"/>
+          <w:szCs w:val="18"/>
+        </w:rPr>
+        <w:t>et ceci en date du</w:t>
+      </w:r>
+      <w:r>
+        <w:rPr>
+          <w:rFonts w:asciiTheme="minorHAnsi" w:hAnsiTheme="minorHAnsi" w:cstheme="minorHAnsi"/>
           <w:b/>
           <w:sz w:val="18"/>
           <w:szCs w:val="18"/>
         </w:rPr>
         <w:t xml:space="preserve"> </w:t>
       </w:r>
-      <w:r>
-        <w:rPr>
-          <w:rFonts w:asciiTheme="majorBidi" w:hAnsiTheme="majorBidi" w:cstheme="majorBidi"/>
-          <w:bCs/>
-          <w:sz w:val="18"/>
-          <w:szCs w:val="18"/>
-        </w:rPr>
-        <w:t>et ceci en date du</w:t>
-      </w:r>
-      <w:r>
-        <w:rPr>
-          <w:rFonts w:asciiTheme="majorBidi" w:hAnsiTheme="majorBidi" w:cstheme="majorBidi"/>
-          <w:b/>
-          <w:sz w:val="18"/>
-          <w:szCs w:val="18"/>
-        </w:rPr>
-        <w:t xml:space="preserve"> </w:t>
-      </w:r>
-      <w:r>
-        <w:rPr>
-          <w:rFonts w:asciiTheme="majorBidi" w:hAnsiTheme="majorBidi" w:cstheme="majorBidi"/>
-          <w:b/>
-          <w:sz w:val="18"/>
-          <w:szCs w:val="18"/>
-        </w:rPr>
-        <w:t>{{ DTAE_CONTRAT }}</w:t>
-      </w:r>
-      <w:r>
-        <w:rPr>
-          <w:rFonts w:asciiTheme="majorBidi" w:hAnsiTheme="majorBidi" w:cstheme="majorBidi"/>
+      <w:proofErr w:type="gramStart"/>
+      <w:r>
+        <w:rPr>
+          <w:rFonts w:asciiTheme="minorHAnsi" w:hAnsiTheme="minorHAnsi" w:cstheme="minorHAnsi"/>
+          <w:b/>
+          <w:sz w:val="18"/>
+          <w:szCs w:val="18"/>
+        </w:rPr>
+        <w:t>{{ DTAE</w:t>
+      </w:r>
+      <w:proofErr w:type="gramEnd"/>
+      <w:r>
+        <w:rPr>
+          <w:rFonts w:asciiTheme="minorHAnsi" w:hAnsiTheme="minorHAnsi" w:cstheme="minorHAnsi"/>
+          <w:b/>
+          <w:sz w:val="18"/>
+          <w:szCs w:val="18"/>
+        </w:rPr>
+        <w:t>_</w:t>
+      </w:r>
+      <w:proofErr w:type="gramStart"/>
+      <w:r>
+        <w:rPr>
+          <w:rFonts w:asciiTheme="minorHAnsi" w:hAnsiTheme="minorHAnsi" w:cstheme="minorHAnsi"/>
+          <w:b/>
+          <w:sz w:val="18"/>
+          <w:szCs w:val="18"/>
+        </w:rPr>
+        <w:t>CONTRAT }</w:t>
+      </w:r>
+      <w:proofErr w:type="gramEnd"/>
+      <w:r>
+        <w:rPr>
+          <w:rFonts w:asciiTheme="minorHAnsi" w:hAnsiTheme="minorHAnsi" w:cstheme="minorHAnsi"/>
+          <w:b/>
+          <w:sz w:val="18"/>
+          <w:szCs w:val="18"/>
+        </w:rPr>
+        <w:t>}</w:t>
+      </w:r>
+      <w:r>
+        <w:rPr>
+          <w:rFonts w:asciiTheme="minorHAnsi" w:hAnsiTheme="minorHAnsi" w:cstheme="minorHAnsi"/>
           <w:b/>
           <w:sz w:val="18"/>
           <w:szCs w:val="18"/>
@@ -1437,7 +1929,7 @@
       <w:pPr>
         <w:jc w:val="both"/>
         <w:rPr>
-          <w:rFonts w:asciiTheme="majorBidi" w:hAnsiTheme="majorBidi" w:cstheme="majorBidi"/>
+          <w:rFonts w:asciiTheme="minorHAnsi" w:hAnsiTheme="minorHAnsi" w:cstheme="minorHAnsi"/>
           <w:bCs/>
           <w:sz w:val="18"/>
           <w:szCs w:val="18"/>
@@ -1451,7 +1943,7 @@
         </w:tabs>
         <w:jc w:val="both"/>
         <w:rPr>
-          <w:rFonts w:asciiTheme="majorBidi" w:hAnsiTheme="majorBidi" w:cstheme="majorBidi"/>
+          <w:rFonts w:asciiTheme="minorHAnsi" w:hAnsiTheme="minorHAnsi" w:cstheme="minorHAnsi"/>
           <w:bCs/>
           <w:sz w:val="18"/>
           <w:szCs w:val="18"/>
@@ -1469,7 +1961,7 @@
 </file>
 
 <file path=word/endnotes.xml><?xml version="1.0" encoding="utf-8"?>
-<w:endnotes xmlns:wpc="http://schemas.microsoft.com/office/word/2010/wordprocessingCanvas" xmlns:cx="http://schemas.microsoft.com/office/drawing/2014/chartex" xmlns:cx1="http://schemas.microsoft.com/office/drawing/2015/9/8/chartex" xmlns:cx2="http://schemas.microsoft.com/office/drawing/2015/10/21/chartex" xmlns:cx3="http://schemas.microsoft.com/office/drawing/2016/5/9/chartex" xmlns:cx4="http://schemas.microsoft.com/office/drawing/2016/5/10/chartex" xmlns:cx5="http://schemas.microsoft.com/office/drawing/2016/5/11/chartex" xmlns:cx6="http://schemas.microsoft.com/office/drawing/2016/5/12/chartex" xmlns:cx7="http://schemas.microsoft.com/office/drawing/2016/5/13/chartex" xmlns:cx8="http://schemas.microsoft.com/office/drawing/2016/5/14/chartex" xmlns:mc="http://schemas.openxmlformats.org/markup-compatibility/2006" xmlns:aink="http://schemas.microsoft.com/office/drawing/2016/ink" xmlns:am3d="http://schemas.microsoft.com/office/drawing/2017/model3d" xmlns:o="urn:schemas-microsoft-com:office:office" xmlns:oel="http://schemas.microsoft.com/office/2019/extlst" xmlns:r="http://schemas.openxmlformats.org/officeDocument/2006/relationships" xmlns:m="http://schemas.openxmlformats.org/officeDocument/2006/math" xmlns:v="urn:schemas-microsoft-com:vml" xmlns:wp14="http://schemas.microsoft.com/office/word/2010/wordprocessingDrawing" xmlns:wp="http://schemas.openxmlformats.org/drawingml/2006/wordprocessingDrawing" xmlns:w10="urn:schemas-microsoft-com:office:word" xmlns:w="http://schemas.openxmlformats.org/wordprocessingml/2006/main" xmlns:w14="http://schemas.microsoft.com/office/word/2010/wordml" xmlns:w15="http://schemas.microsoft.com/office/word/2012/wordml" xmlns:w16cex="http://schemas.microsoft.com/office/word/2018/wordml/cex" xmlns:w16cid="http://schemas.microsoft.com/office/word/2016/wordml/cid" xmlns:w16="http://schemas.microsoft.com/office/word/2018/wordml" xmlns:w16sdtdh="http://schemas.microsoft.com/office/word/2020/wordml/sdtdatahash" xmlns:w16se="http://schemas.microsoft.com/office/word/2015/wordml/symex" xmlns:wpg="http://schemas.microsoft.com/office/word/2010/wordprocessingGroup" xmlns:wpi="http://schemas.microsoft.com/office/word/2010/wordprocessingInk" xmlns:wne="http://schemas.microsoft.com/office/word/2006/wordml" xmlns:wps="http://schemas.microsoft.com/office/word/2010/wordprocessingShape" mc:Ignorable="w14 w15 w16se w16cid w16 w16cex w16sdtdh wp14">
+<w:endnotes xmlns:wpc="http://schemas.microsoft.com/office/word/2010/wordprocessingCanvas" xmlns:cx="http://schemas.microsoft.com/office/drawing/2014/chartex" xmlns:cx1="http://schemas.microsoft.com/office/drawing/2015/9/8/chartex" xmlns:cx2="http://schemas.microsoft.com/office/drawing/2015/10/21/chartex" xmlns:cx3="http://schemas.microsoft.com/office/drawing/2016/5/9/chartex" xmlns:cx4="http://schemas.microsoft.com/office/drawing/2016/5/10/chartex" xmlns:cx5="http://schemas.microsoft.com/office/drawing/2016/5/11/chartex" xmlns:cx6="http://schemas.microsoft.com/office/drawing/2016/5/12/chartex" xmlns:cx7="http://schemas.microsoft.com/office/drawing/2016/5/13/chartex" xmlns:cx8="http://schemas.microsoft.com/office/drawing/2016/5/14/chartex" xmlns:mc="http://schemas.openxmlformats.org/markup-compatibility/2006" xmlns:aink="http://schemas.microsoft.com/office/drawing/2016/ink" xmlns:am3d="http://schemas.microsoft.com/office/drawing/2017/model3d" xmlns:o="urn:schemas-microsoft-com:office:office" xmlns:oel="http://schemas.microsoft.com/office/2019/extlst" xmlns:r="http://schemas.openxmlformats.org/officeDocument/2006/relationships" xmlns:m="http://schemas.openxmlformats.org/officeDocument/2006/math" xmlns:v="urn:schemas-microsoft-com:vml" xmlns:wp14="http://schemas.microsoft.com/office/word/2010/wordprocessingDrawing" xmlns:wp="http://schemas.openxmlformats.org/drawingml/2006/wordprocessingDrawing" xmlns:w10="urn:schemas-microsoft-com:office:word" xmlns:w="http://schemas.openxmlformats.org/wordprocessingml/2006/main" xmlns:w14="http://schemas.microsoft.com/office/word/2010/wordml" xmlns:w15="http://schemas.microsoft.com/office/word/2012/wordml" xmlns:w16cex="http://schemas.microsoft.com/office/word/2018/wordml/cex" xmlns:w16cid="http://schemas.microsoft.com/office/word/2016/wordml/cid" xmlns:w16="http://schemas.microsoft.com/office/word/2018/wordml" xmlns:w16du="http://schemas.microsoft.com/office/word/2023/wordml/word16du" xmlns:w16sdtdh="http://schemas.microsoft.com/office/word/2020/wordml/sdtdatahash" xmlns:w16sdtfl="http://schemas.microsoft.com/office/word/2024/wordml/sdtformatlock" xmlns:w16se="http://schemas.microsoft.com/office/word/2015/wordml/symex" xmlns:wpg="http://schemas.microsoft.com/office/word/2010/wordprocessingGroup" xmlns:wpi="http://schemas.microsoft.com/office/word/2010/wordprocessingInk" xmlns:wne="http://schemas.microsoft.com/office/word/2006/wordml" xmlns:wps="http://schemas.microsoft.com/office/word/2010/wordprocessingShape" mc:Ignorable="w14 w15 w16se w16cid w16 w16cex w16sdtdh w16sdtfl w16du wp14">
   <w:endnote w:type="separator" w:id="-1">
     <w:p>
       <w:r>
@@ -1488,7 +1980,7 @@
 </file>
 
 <file path=word/footnotes.xml><?xml version="1.0" encoding="utf-8"?>
-<w:footnotes xmlns:wpc="http://schemas.microsoft.com/office/word/2010/wordprocessingCanvas" xmlns:cx="http://schemas.microsoft.com/office/drawing/2014/chartex" xmlns:cx1="http://schemas.microsoft.com/office/drawing/2015/9/8/chartex" xmlns:cx2="http://schemas.microsoft.com/office/drawing/2015/10/21/chartex" xmlns:cx3="http://schemas.microsoft.com/office/drawing/2016/5/9/chartex" xmlns:cx4="http://schemas.microsoft.com/office/drawing/2016/5/10/chartex" xmlns:cx5="http://schemas.microsoft.com/office/drawing/2016/5/11/chartex" xmlns:cx6="http://schemas.microsoft.com/office/drawing/2016/5/12/chartex" xmlns:cx7="http://schemas.microsoft.com/office/drawing/2016/5/13/chartex" xmlns:cx8="http://schemas.microsoft.com/office/drawing/2016/5/14/chartex" xmlns:mc="http://schemas.openxmlformats.org/markup-compatibility/2006" xmlns:aink="http://schemas.microsoft.com/office/drawing/2016/ink" xmlns:am3d="http://schemas.microsoft.com/office/drawing/2017/model3d" xmlns:o="urn:schemas-microsoft-com:office:office" xmlns:oel="http://schemas.microsoft.com/office/2019/extlst" xmlns:r="http://schemas.openxmlformats.org/officeDocument/2006/relationships" xmlns:m="http://schemas.openxmlformats.org/officeDocument/2006/math" xmlns:v="urn:schemas-microsoft-com:vml" xmlns:wp14="http://schemas.microsoft.com/office/word/2010/wordprocessingDrawing" xmlns:wp="http://schemas.openxmlformats.org/drawingml/2006/wordprocessingDrawing" xmlns:w10="urn:schemas-microsoft-com:office:word" xmlns:w="http://schemas.openxmlformats.org/wordprocessingml/2006/main" xmlns:w14="http://schemas.microsoft.com/office/word/2010/wordml" xmlns:w15="http://schemas.microsoft.com/office/word/2012/wordml" xmlns:w16cex="http://schemas.microsoft.com/office/word/2018/wordml/cex" xmlns:w16cid="http://schemas.microsoft.com/office/word/2016/wordml/cid" xmlns:w16="http://schemas.microsoft.com/office/word/2018/wordml" xmlns:w16sdtdh="http://schemas.microsoft.com/office/word/2020/wordml/sdtdatahash" xmlns:w16se="http://schemas.microsoft.com/office/word/2015/wordml/symex" xmlns:wpg="http://schemas.microsoft.com/office/word/2010/wordprocessingGroup" xmlns:wpi="http://schemas.microsoft.com/office/word/2010/wordprocessingInk" xmlns:wne="http://schemas.microsoft.com/office/word/2006/wordml" xmlns:wps="http://schemas.microsoft.com/office/word/2010/wordprocessingShape" mc:Ignorable="w14 w15 w16se w16cid w16 w16cex w16sdtdh wp14">
+<w:footnotes xmlns:wpc="http://schemas.microsoft.com/office/word/2010/wordprocessingCanvas" xmlns:cx="http://schemas.microsoft.com/office/drawing/2014/chartex" xmlns:cx1="http://schemas.microsoft.com/office/drawing/2015/9/8/chartex" xmlns:cx2="http://schemas.microsoft.com/office/drawing/2015/10/21/chartex" xmlns:cx3="http://schemas.microsoft.com/office/drawing/2016/5/9/chartex" xmlns:cx4="http://schemas.microsoft.com/office/drawing/2016/5/10/chartex" xmlns:cx5="http://schemas.microsoft.com/office/drawing/2016/5/11/chartex" xmlns:cx6="http://schemas.microsoft.com/office/drawing/2016/5/12/chartex" xmlns:cx7="http://schemas.microsoft.com/office/drawing/2016/5/13/chartex" xmlns:cx8="http://schemas.microsoft.com/office/drawing/2016/5/14/chartex" xmlns:mc="http://schemas.openxmlformats.org/markup-compatibility/2006" xmlns:aink="http://schemas.microsoft.com/office/drawing/2016/ink" xmlns:am3d="http://schemas.microsoft.com/office/drawing/2017/model3d" xmlns:o="urn:schemas-microsoft-com:office:office" xmlns:oel="http://schemas.microsoft.com/office/2019/extlst" xmlns:r="http://schemas.openxmlformats.org/officeDocument/2006/relationships" xmlns:m="http://schemas.openxmlformats.org/officeDocument/2006/math" xmlns:v="urn:schemas-microsoft-com:vml" xmlns:wp14="http://schemas.microsoft.com/office/word/2010/wordprocessingDrawing" xmlns:wp="http://schemas.openxmlformats.org/drawingml/2006/wordprocessingDrawing" xmlns:w10="urn:schemas-microsoft-com:office:word" xmlns:w="http://schemas.openxmlformats.org/wordprocessingml/2006/main" xmlns:w14="http://schemas.microsoft.com/office/word/2010/wordml" xmlns:w15="http://schemas.microsoft.com/office/word/2012/wordml" xmlns:w16cex="http://schemas.microsoft.com/office/word/2018/wordml/cex" xmlns:w16cid="http://schemas.microsoft.com/office/word/2016/wordml/cid" xmlns:w16="http://schemas.microsoft.com/office/word/2018/wordml" xmlns:w16du="http://schemas.microsoft.com/office/word/2023/wordml/word16du" xmlns:w16sdtdh="http://schemas.microsoft.com/office/word/2020/wordml/sdtdatahash" xmlns:w16sdtfl="http://schemas.microsoft.com/office/word/2024/wordml/sdtformatlock" xmlns:w16se="http://schemas.microsoft.com/office/word/2015/wordml/symex" xmlns:wpg="http://schemas.microsoft.com/office/word/2010/wordprocessingGroup" xmlns:wpi="http://schemas.microsoft.com/office/word/2010/wordprocessingInk" xmlns:wne="http://schemas.microsoft.com/office/word/2006/wordml" xmlns:wps="http://schemas.microsoft.com/office/word/2010/wordprocessingShape" mc:Ignorable="w14 w15 w16se w16cid w16 w16cex w16sdtdh w16sdtfl w16du wp14">
   <w:footnote w:type="separator" w:id="-1">
     <w:p>
       <w:r>
@@ -1507,7 +1999,7 @@
 </file>
 
 <file path=word/numbering.xml><?xml version="1.0" encoding="utf-8"?>
-<w:numbering xmlns:wpc="http://schemas.microsoft.com/office/word/2010/wordprocessingCanvas" xmlns:cx="http://schemas.microsoft.com/office/drawing/2014/chartex" xmlns:cx1="http://schemas.microsoft.com/office/drawing/2015/9/8/chartex" xmlns:cx2="http://schemas.microsoft.com/office/drawing/2015/10/21/chartex" xmlns:cx3="http://schemas.microsoft.com/office/drawing/2016/5/9/chartex" xmlns:cx4="http://schemas.microsoft.com/office/drawing/2016/5/10/chartex" xmlns:cx5="http://schemas.microsoft.com/office/drawing/2016/5/11/chartex" xmlns:cx6="http://schemas.microsoft.com/office/drawing/2016/5/12/chartex" xmlns:cx7="http://schemas.microsoft.com/office/drawing/2016/5/13/chartex" xmlns:cx8="http://schemas.microsoft.com/office/drawing/2016/5/14/chartex" xmlns:mc="http://schemas.openxmlformats.org/markup-compatibility/2006" xmlns:aink="http://schemas.microsoft.com/office/drawing/2016/ink" xmlns:am3d="http://schemas.microsoft.com/office/drawing/2017/model3d" xmlns:o="urn:schemas-microsoft-com:office:office" xmlns:oel="http://schemas.microsoft.com/office/2019/extlst" xmlns:r="http://schemas.openxmlformats.org/officeDocument/2006/relationships" xmlns:m="http://schemas.openxmlformats.org/officeDocument/2006/math" xmlns:v="urn:schemas-microsoft-com:vml" xmlns:wp14="http://schemas.microsoft.com/office/word/2010/wordprocessingDrawing" xmlns:wp="http://schemas.openxmlformats.org/drawingml/2006/wordprocessingDrawing" xmlns:w10="urn:schemas-microsoft-com:office:word" xmlns:w="http://schemas.openxmlformats.org/wordprocessingml/2006/main" xmlns:w14="http://schemas.microsoft.com/office/word/2010/wordml" xmlns:w15="http://schemas.microsoft.com/office/word/2012/wordml" xmlns:w16cex="http://schemas.microsoft.com/office/word/2018/wordml/cex" xmlns:w16cid="http://schemas.microsoft.com/office/word/2016/wordml/cid" xmlns:w16="http://schemas.microsoft.com/office/word/2018/wordml" xmlns:w16sdtdh="http://schemas.microsoft.com/office/word/2020/wordml/sdtdatahash" xmlns:w16se="http://schemas.microsoft.com/office/word/2015/wordml/symex" xmlns:wpg="http://schemas.microsoft.com/office/word/2010/wordprocessingGroup" xmlns:wpi="http://schemas.microsoft.com/office/word/2010/wordprocessingInk" xmlns:wne="http://schemas.microsoft.com/office/word/2006/wordml" xmlns:wps="http://schemas.microsoft.com/office/word/2010/wordprocessingShape" mc:Ignorable="w14 w15 w16se w16cid w16 w16cex w16sdtdh wp14">
+<w:numbering xmlns:wpc="http://schemas.microsoft.com/office/word/2010/wordprocessingCanvas" xmlns:cx="http://schemas.microsoft.com/office/drawing/2014/chartex" xmlns:cx1="http://schemas.microsoft.com/office/drawing/2015/9/8/chartex" xmlns:cx2="http://schemas.microsoft.com/office/drawing/2015/10/21/chartex" xmlns:cx3="http://schemas.microsoft.com/office/drawing/2016/5/9/chartex" xmlns:cx4="http://schemas.microsoft.com/office/drawing/2016/5/10/chartex" xmlns:cx5="http://schemas.microsoft.com/office/drawing/2016/5/11/chartex" xmlns:cx6="http://schemas.microsoft.com/office/drawing/2016/5/12/chartex" xmlns:cx7="http://schemas.microsoft.com/office/drawing/2016/5/13/chartex" xmlns:cx8="http://schemas.microsoft.com/office/drawing/2016/5/14/chartex" xmlns:mc="http://schemas.openxmlformats.org/markup-compatibility/2006" xmlns:aink="http://schemas.microsoft.com/office/drawing/2016/ink" xmlns:am3d="http://schemas.microsoft.com/office/drawing/2017/model3d" xmlns:o="urn:schemas-microsoft-com:office:office" xmlns:oel="http://schemas.microsoft.com/office/2019/extlst" xmlns:r="http://schemas.openxmlformats.org/officeDocument/2006/relationships" xmlns:m="http://schemas.openxmlformats.org/officeDocument/2006/math" xmlns:v="urn:schemas-microsoft-com:vml" xmlns:wp14="http://schemas.microsoft.com/office/word/2010/wordprocessingDrawing" xmlns:wp="http://schemas.openxmlformats.org/drawingml/2006/wordprocessingDrawing" xmlns:w10="urn:schemas-microsoft-com:office:word" xmlns:w="http://schemas.openxmlformats.org/wordprocessingml/2006/main" xmlns:w14="http://schemas.microsoft.com/office/word/2010/wordml" xmlns:w15="http://schemas.microsoft.com/office/word/2012/wordml" xmlns:w16cex="http://schemas.microsoft.com/office/word/2018/wordml/cex" xmlns:w16cid="http://schemas.microsoft.com/office/word/2016/wordml/cid" xmlns:w16="http://schemas.microsoft.com/office/word/2018/wordml" xmlns:w16du="http://schemas.microsoft.com/office/word/2023/wordml/word16du" xmlns:w16sdtdh="http://schemas.microsoft.com/office/word/2020/wordml/sdtdatahash" xmlns:w16sdtfl="http://schemas.microsoft.com/office/word/2024/wordml/sdtformatlock" xmlns:w16se="http://schemas.microsoft.com/office/word/2015/wordml/symex" xmlns:wpg="http://schemas.microsoft.com/office/word/2010/wordprocessingGroup" xmlns:wpi="http://schemas.microsoft.com/office/word/2010/wordprocessingInk" xmlns:wne="http://schemas.microsoft.com/office/word/2006/wordml" xmlns:wps="http://schemas.microsoft.com/office/word/2010/wordprocessingShape" mc:Ignorable="w14 w15 w16se w16cid w16 w16cex w16sdtdh w16sdtfl w16du wp14">
   <w:numPicBullet w:numPicBulletId="0">
     <w:pict>
       <v:shapetype id="_x0000_t75" coordsize="21600,21600" o:spt="75" o:preferrelative="t" path="m@4@5l@4@11@9@11@9@5xe" filled="f" stroked="f">
@@ -1529,14 +2021,14 @@
         <v:path o:extrusionok="f" gradientshapeok="t" o:connecttype="rect"/>
         <o:lock v:ext="edit" aspectratio="t"/>
       </v:shapetype>
-      <v:shape id="_x0000_i1038" type="#_x0000_t75" style="width:11.25pt;height:11.25pt" o:bullet="t">
+      <v:shape id="_x0000_i1025" type="#_x0000_t75" style="width:11.25pt;height:11.25pt" o:bullet="t">
         <v:imagedata r:id="rId1" o:title="msoFA43"/>
       </v:shape>
     </w:pict>
   </w:numPicBullet>
   <w:numPicBullet w:numPicBulletId="1">
     <w:pict>
-      <v:shape id="_x0000_i1039" type="#_x0000_t75" style="width:11.25pt;height:11.25pt" o:bullet="t">
+      <v:shape id="_x0000_i1026" type="#_x0000_t75" style="width:11.25pt;height:11.25pt" o:bullet="t">
         <v:imagedata r:id="rId2" o:title="msoFA43"/>
       </v:shape>
     </w:pict>
@@ -2942,7 +3434,7 @@
 </file>
 
 <file path=word/styles.xml><?xml version="1.0" encoding="utf-8"?>
-<w:styles xmlns:mc="http://schemas.openxmlformats.org/markup-compatibility/2006" xmlns:r="http://schemas.openxmlformats.org/officeDocument/2006/relationships" xmlns:w="http://schemas.openxmlformats.org/wordprocessingml/2006/main" xmlns:w14="http://schemas.microsoft.com/office/word/2010/wordml" xmlns:w15="http://schemas.microsoft.com/office/word/2012/wordml" xmlns:w16cex="http://schemas.microsoft.com/office/word/2018/wordml/cex" xmlns:w16cid="http://schemas.microsoft.com/office/word/2016/wordml/cid" xmlns:w16="http://schemas.microsoft.com/office/word/2018/wordml" xmlns:w16sdtdh="http://schemas.microsoft.com/office/word/2020/wordml/sdtdatahash" xmlns:w16se="http://schemas.microsoft.com/office/word/2015/wordml/symex" mc:Ignorable="w14 w15 w16se w16cid w16 w16cex w16sdtdh">
+<w:styles xmlns:mc="http://schemas.openxmlformats.org/markup-compatibility/2006" xmlns:r="http://schemas.openxmlformats.org/officeDocument/2006/relationships" xmlns:w="http://schemas.openxmlformats.org/wordprocessingml/2006/main" xmlns:w14="http://schemas.microsoft.com/office/word/2010/wordml" xmlns:w15="http://schemas.microsoft.com/office/word/2012/wordml" xmlns:w16cex="http://schemas.microsoft.com/office/word/2018/wordml/cex" xmlns:w16cid="http://schemas.microsoft.com/office/word/2016/wordml/cid" xmlns:w16="http://schemas.microsoft.com/office/word/2018/wordml" xmlns:w16du="http://schemas.microsoft.com/office/word/2023/wordml/word16du" xmlns:w16sdtdh="http://schemas.microsoft.com/office/word/2020/wordml/sdtdatahash" xmlns:w16sdtfl="http://schemas.microsoft.com/office/word/2024/wordml/sdtformatlock" xmlns:w16se="http://schemas.microsoft.com/office/word/2015/wordml/symex" mc:Ignorable="w14 w15 w16se w16cid w16 w16cex w16sdtdh w16sdtfl w16du">
   <w:docDefaults>
     <w:rPrDefault>
       <w:rPr>

</xml_diff>